<commit_message>
(all) hyperparameter fix and use stochastic seeding everywhere
</commit_message>
<xml_diff>
--- a/docs/Diplomski_rad_predlozak_travanj_2020.docx
+++ b/docs/Diplomski_rad_predlozak_travanj_2020.docx
@@ -11473,6 +11473,2667 @@
       </w:r>
       <w:bookmarkEnd w:id="73"/>
     </w:p>
+    <w:p/>
+    <w:tbl>
+      <w:tblPr>
+        <w:tblStyle w:val="TableGrid"/>
+        <w:tblW w:w="0" w:type="auto"/>
+        <w:tblLook w:val="04A0" w:firstRow="1" w:lastRow="0" w:firstColumn="1" w:lastColumn="0" w:noHBand="0" w:noVBand="1"/>
+      </w:tblPr>
+      <w:tblGrid>
+        <w:gridCol w:w="3910"/>
+        <w:gridCol w:w="1946"/>
+        <w:gridCol w:w="2922"/>
+      </w:tblGrid>
+      <w:tr>
+        <w:tc>
+          <w:tcPr>
+            <w:tcW w:w="3910" w:type="dxa"/>
+          </w:tcPr>
+          <w:p>
+            <w:r>
+              <w:t>Varijabla</w:t>
+            </w:r>
+          </w:p>
+        </w:tc>
+        <w:tc>
+          <w:tcPr>
+            <w:tcW w:w="1946" w:type="dxa"/>
+          </w:tcPr>
+          <w:p>
+            <w:r>
+              <w:t>Opis</w:t>
+            </w:r>
+          </w:p>
+        </w:tc>
+        <w:tc>
+          <w:tcPr>
+            <w:tcW w:w="2922" w:type="dxa"/>
+          </w:tcPr>
+          <w:p>
+            <w:r>
+              <w:t>Prostor pretrage</w:t>
+            </w:r>
+          </w:p>
+        </w:tc>
+      </w:tr>
+      <w:tr>
+        <w:tc>
+          <w:tcPr>
+            <w:tcW w:w="3910" w:type="dxa"/>
+          </w:tcPr>
+          <w:p>
+            <w:r>
+              <w:t>MAX_CLUSTER_DISTANCE</w:t>
+            </w:r>
+          </w:p>
+        </w:tc>
+        <w:tc>
+          <w:tcPr>
+            <w:tcW w:w="1946" w:type="dxa"/>
+          </w:tcPr>
+          <w:p>
+            <w:r>
+              <w:t>Najveća najmanja udaljenost između nove točke grupe i neke točke u grupi</w:t>
+            </w:r>
+            <w:r>
+              <w:t xml:space="preserve"> [km]</w:t>
+            </w:r>
+          </w:p>
+        </w:tc>
+        <w:tc>
+          <w:tcPr>
+            <w:tcW w:w="2922" w:type="dxa"/>
+          </w:tcPr>
+          <w:p>
+            <m:oMathPara>
+              <m:oMath>
+                <m:r>
+                  <w:rPr>
+                    <w:rFonts w:ascii="Cambria Math" w:hAnsi="Cambria Math"/>
+                  </w:rPr>
+                  <m:t>x∈</m:t>
+                </m:r>
+                <m:d>
+                  <m:dPr>
+                    <m:begChr m:val="["/>
+                    <m:endChr m:val="]"/>
+                    <m:ctrlPr>
+                      <w:rPr>
+                        <w:rFonts w:ascii="Cambria Math" w:hAnsi="Cambria Math"/>
+                        <w:i/>
+                      </w:rPr>
+                    </m:ctrlPr>
+                  </m:dPr>
+                  <m:e>
+                    <m:r>
+                      <w:rPr>
+                        <w:rFonts w:ascii="Cambria Math" w:hAnsi="Cambria Math"/>
+                      </w:rPr>
+                      <m:t>1, 12</m:t>
+                    </m:r>
+                  </m:e>
+                </m:d>
+                <m:r>
+                  <w:rPr>
+                    <w:rFonts w:ascii="Cambria Math" w:hAnsi="Cambria Math"/>
+                  </w:rPr>
+                  <m:t>, x∈R</m:t>
+                </m:r>
+              </m:oMath>
+            </m:oMathPara>
+          </w:p>
+        </w:tc>
+      </w:tr>
+      <w:tr>
+        <w:tc>
+          <w:tcPr>
+            <w:tcW w:w="3910" w:type="dxa"/>
+          </w:tcPr>
+          <w:p>
+            <w:r>
+              <w:t>MAX_CLUSTER_JOIN_DISTANCE</w:t>
+            </w:r>
+          </w:p>
+        </w:tc>
+        <w:tc>
+          <w:tcPr>
+            <w:tcW w:w="1946" w:type="dxa"/>
+          </w:tcPr>
+          <w:p>
+            <w:r>
+              <w:t>Najveća udaljenost iznad koje nema smisla spajati grupe</w:t>
+            </w:r>
+            <w:r>
+              <w:t xml:space="preserve"> [km]</w:t>
+            </w:r>
+          </w:p>
+        </w:tc>
+        <w:tc>
+          <w:tcPr>
+            <w:tcW w:w="2922" w:type="dxa"/>
+          </w:tcPr>
+          <w:p>
+            <m:oMathPara>
+              <m:oMath>
+                <m:r>
+                  <w:rPr>
+                    <w:rFonts w:ascii="Cambria Math" w:hAnsi="Cambria Math"/>
+                  </w:rPr>
+                  <m:t>x∈</m:t>
+                </m:r>
+                <m:d>
+                  <m:dPr>
+                    <m:begChr m:val="["/>
+                    <m:endChr m:val="]"/>
+                    <m:ctrlPr>
+                      <w:rPr>
+                        <w:rFonts w:ascii="Cambria Math" w:hAnsi="Cambria Math"/>
+                        <w:i/>
+                      </w:rPr>
+                    </m:ctrlPr>
+                  </m:dPr>
+                  <m:e>
+                    <m:r>
+                      <w:rPr>
+                        <w:rFonts w:ascii="Cambria Math" w:hAnsi="Cambria Math"/>
+                      </w:rPr>
+                      <m:t>2, 20</m:t>
+                    </m:r>
+                  </m:e>
+                </m:d>
+                <m:r>
+                  <w:rPr>
+                    <w:rFonts w:ascii="Cambria Math" w:hAnsi="Cambria Math"/>
+                  </w:rPr>
+                  <m:t>, x∈R</m:t>
+                </m:r>
+              </m:oMath>
+            </m:oMathPara>
+          </w:p>
+        </w:tc>
+      </w:tr>
+      <w:tr>
+        <w:tc>
+          <w:tcPr>
+            <w:tcW w:w="3910" w:type="dxa"/>
+          </w:tcPr>
+          <w:p>
+            <w:r>
+              <w:t>populationSize</w:t>
+            </w:r>
+          </w:p>
+        </w:tc>
+        <w:tc>
+          <w:tcPr>
+            <w:tcW w:w="1946" w:type="dxa"/>
+          </w:tcPr>
+          <w:p>
+            <w:r>
+              <w:t>Veličina populacije u jednom genetskom algoritmu</w:t>
+            </w:r>
+          </w:p>
+        </w:tc>
+        <w:tc>
+          <w:tcPr>
+            <w:tcW w:w="2922" w:type="dxa"/>
+          </w:tcPr>
+          <w:p>
+            <m:oMathPara>
+              <m:oMath>
+                <m:r>
+                  <w:rPr>
+                    <w:rFonts w:ascii="Cambria Math" w:hAnsi="Cambria Math"/>
+                  </w:rPr>
+                  <m:t>x</m:t>
+                </m:r>
+                <m:r>
+                  <w:rPr>
+                    <w:rFonts w:ascii="Cambria Math" w:hAnsi="Cambria Math"/>
+                  </w:rPr>
+                  <m:t>∈</m:t>
+                </m:r>
+                <m:r>
+                  <w:rPr>
+                    <w:rFonts w:ascii="Cambria Math" w:hAnsi="Cambria Math"/>
+                  </w:rPr>
+                  <m:t xml:space="preserve">{50, 200, 500, </m:t>
+                </m:r>
+              </m:oMath>
+            </m:oMathPara>
+          </w:p>
+          <w:p>
+            <m:oMathPara>
+              <m:oMath>
+                <m:r>
+                  <w:rPr>
+                    <w:rFonts w:ascii="Cambria Math" w:hAnsi="Cambria Math"/>
+                  </w:rPr>
+                  <m:t>1000, 5000}</m:t>
+                </m:r>
+              </m:oMath>
+            </m:oMathPara>
+          </w:p>
+        </w:tc>
+      </w:tr>
+      <w:tr>
+        <w:tc>
+          <w:tcPr>
+            <w:tcW w:w="3910" w:type="dxa"/>
+          </w:tcPr>
+          <w:p>
+            <w:r>
+              <w:t>Generations</w:t>
+            </w:r>
+          </w:p>
+        </w:tc>
+        <w:tc>
+          <w:tcPr>
+            <w:tcW w:w="1946" w:type="dxa"/>
+          </w:tcPr>
+          <w:p>
+            <w:r>
+              <w:t>Broj iteracija genetskog algoritma</w:t>
+            </w:r>
+          </w:p>
+        </w:tc>
+        <w:tc>
+          <w:tcPr>
+            <w:tcW w:w="2922" w:type="dxa"/>
+          </w:tcPr>
+          <w:p>
+            <m:oMathPara>
+              <m:oMath>
+                <m:r>
+                  <w:rPr>
+                    <w:rFonts w:ascii="Cambria Math" w:hAnsi="Cambria Math"/>
+                  </w:rPr>
+                  <m:t>x</m:t>
+                </m:r>
+                <m:r>
+                  <w:rPr>
+                    <w:rFonts w:ascii="Cambria Math" w:hAnsi="Cambria Math"/>
+                  </w:rPr>
+                  <m:t>∈{</m:t>
+                </m:r>
+                <m:r>
+                  <w:rPr>
+                    <w:rFonts w:ascii="Cambria Math" w:hAnsi="Cambria Math"/>
+                  </w:rPr>
+                  <m:t>500</m:t>
+                </m:r>
+                <m:r>
+                  <w:rPr>
+                    <w:rFonts w:ascii="Cambria Math" w:hAnsi="Cambria Math"/>
+                  </w:rPr>
+                  <m:t>, 20</m:t>
+                </m:r>
+                <m:r>
+                  <w:rPr>
+                    <w:rFonts w:ascii="Cambria Math" w:hAnsi="Cambria Math"/>
+                  </w:rPr>
+                  <m:t>0</m:t>
+                </m:r>
+                <m:r>
+                  <w:rPr>
+                    <w:rFonts w:ascii="Cambria Math" w:hAnsi="Cambria Math"/>
+                  </w:rPr>
+                  <m:t>0, 5</m:t>
+                </m:r>
+                <m:r>
+                  <w:rPr>
+                    <w:rFonts w:ascii="Cambria Math" w:hAnsi="Cambria Math"/>
+                  </w:rPr>
+                  <m:t>0</m:t>
+                </m:r>
+                <m:r>
+                  <w:rPr>
+                    <w:rFonts w:ascii="Cambria Math" w:hAnsi="Cambria Math"/>
+                  </w:rPr>
+                  <m:t xml:space="preserve">00, </m:t>
+                </m:r>
+              </m:oMath>
+            </m:oMathPara>
+          </w:p>
+          <w:p>
+            <m:oMathPara>
+              <m:oMath>
+                <m:r>
+                  <w:rPr>
+                    <w:rFonts w:ascii="Cambria Math" w:hAnsi="Cambria Math"/>
+                  </w:rPr>
+                  <m:t>8000</m:t>
+                </m:r>
+                <m:r>
+                  <w:rPr>
+                    <w:rFonts w:ascii="Cambria Math" w:hAnsi="Cambria Math"/>
+                  </w:rPr>
+                  <m:t>}</m:t>
+                </m:r>
+              </m:oMath>
+            </m:oMathPara>
+          </w:p>
+        </w:tc>
+      </w:tr>
+      <w:tr>
+        <w:tc>
+          <w:tcPr>
+            <w:tcW w:w="3910" w:type="dxa"/>
+          </w:tcPr>
+          <w:p>
+            <w:r>
+              <w:t>Selection type</w:t>
+            </w:r>
+          </w:p>
+        </w:tc>
+        <w:tc>
+          <w:tcPr>
+            <w:tcW w:w="1946" w:type="dxa"/>
+          </w:tcPr>
+          <w:p>
+            <w:r>
+              <w:t>Koji operator selekcije koristiti</w:t>
+            </w:r>
+          </w:p>
+        </w:tc>
+        <w:tc>
+          <w:tcPr>
+            <w:tcW w:w="2922" w:type="dxa"/>
+          </w:tcPr>
+          <w:p>
+            <w:r>
+              <w:t>„TournamentSelection“, „RankSelection“</w:t>
+            </w:r>
+          </w:p>
+        </w:tc>
+      </w:tr>
+      <w:tr>
+        <w:tc>
+          <w:tcPr>
+            <w:tcW w:w="3910" w:type="dxa"/>
+          </w:tcPr>
+          <w:p>
+            <w:r>
+              <w:t>Selection_tournamentSize</w:t>
+            </w:r>
+          </w:p>
+        </w:tc>
+        <w:tc>
+          <w:tcPr>
+            <w:tcW w:w="1946" w:type="dxa"/>
+          </w:tcPr>
+          <w:p>
+            <w:r>
+              <w:t>Veličina turnira u turnirskoj selekciji</w:t>
+            </w:r>
+          </w:p>
+        </w:tc>
+        <w:tc>
+          <w:tcPr>
+            <w:tcW w:w="2922" w:type="dxa"/>
+          </w:tcPr>
+          <w:p>
+            <m:oMathPara>
+              <m:oMath>
+                <m:r>
+                  <w:rPr>
+                    <w:rFonts w:ascii="Cambria Math" w:hAnsi="Cambria Math"/>
+                  </w:rPr>
+                  <m:t>x∈</m:t>
+                </m:r>
+                <m:d>
+                  <m:dPr>
+                    <m:begChr m:val="["/>
+                    <m:endChr m:val="]"/>
+                    <m:ctrlPr>
+                      <w:rPr>
+                        <w:rFonts w:ascii="Cambria Math" w:hAnsi="Cambria Math"/>
+                        <w:i/>
+                      </w:rPr>
+                    </m:ctrlPr>
+                  </m:dPr>
+                  <m:e>
+                    <m:r>
+                      <w:rPr>
+                        <w:rFonts w:ascii="Cambria Math" w:hAnsi="Cambria Math"/>
+                      </w:rPr>
+                      <m:t>2, 6</m:t>
+                    </m:r>
+                  </m:e>
+                </m:d>
+                <m:r>
+                  <w:rPr>
+                    <w:rFonts w:ascii="Cambria Math" w:hAnsi="Cambria Math"/>
+                  </w:rPr>
+                  <m:t>, x∈</m:t>
+                </m:r>
+                <m:r>
+                  <w:rPr>
+                    <w:rFonts w:ascii="Cambria Math" w:hAnsi="Cambria Math"/>
+                  </w:rPr>
+                  <m:t>N</m:t>
+                </m:r>
+              </m:oMath>
+            </m:oMathPara>
+          </w:p>
+        </w:tc>
+      </w:tr>
+      <w:tr>
+        <w:tc>
+          <w:tcPr>
+            <w:tcW w:w="3910" w:type="dxa"/>
+          </w:tcPr>
+          <w:p>
+            <w:r>
+              <w:lastRenderedPageBreak/>
+              <w:t xml:space="preserve"> Elimination type</w:t>
+            </w:r>
+          </w:p>
+        </w:tc>
+        <w:tc>
+          <w:tcPr>
+            <w:tcW w:w="1946" w:type="dxa"/>
+          </w:tcPr>
+          <w:p>
+            <w:r>
+              <w:t>Koje operator eliminacije koristiti</w:t>
+            </w:r>
+          </w:p>
+        </w:tc>
+        <w:tc>
+          <w:tcPr>
+            <w:tcW w:w="2922" w:type="dxa"/>
+          </w:tcPr>
+          <w:p>
+            <w:r>
+              <w:t>„EliteEliminator“, „EliteGeometricEliminator“</w:t>
+            </w:r>
+          </w:p>
+        </w:tc>
+      </w:tr>
+      <w:tr>
+        <w:tc>
+          <w:tcPr>
+            <w:tcW w:w="3910" w:type="dxa"/>
+          </w:tcPr>
+          <w:p>
+            <w:r>
+              <w:t>Eliminator_elitism</w:t>
+            </w:r>
+          </w:p>
+        </w:tc>
+        <w:tc>
+          <w:tcPr>
+            <w:tcW w:w="1946" w:type="dxa"/>
+          </w:tcPr>
+          <w:p>
+            <w:r>
+              <w:t>Broj jedinki koje preživljavaju eliminaciju u elitističkom eliminatoru</w:t>
+            </w:r>
+          </w:p>
+        </w:tc>
+        <w:tc>
+          <w:tcPr>
+            <w:tcW w:w="2922" w:type="dxa"/>
+          </w:tcPr>
+          <w:p>
+            <m:oMathPara>
+              <m:oMath>
+                <m:r>
+                  <w:rPr>
+                    <w:rFonts w:ascii="Cambria Math" w:hAnsi="Cambria Math"/>
+                  </w:rPr>
+                  <m:t>x∈</m:t>
+                </m:r>
+                <m:d>
+                  <m:dPr>
+                    <m:begChr m:val="["/>
+                    <m:endChr m:val="]"/>
+                    <m:ctrlPr>
+                      <w:rPr>
+                        <w:rFonts w:ascii="Cambria Math" w:hAnsi="Cambria Math"/>
+                        <w:i/>
+                      </w:rPr>
+                    </m:ctrlPr>
+                  </m:dPr>
+                  <m:e>
+                    <m:r>
+                      <w:rPr>
+                        <w:rFonts w:ascii="Cambria Math" w:hAnsi="Cambria Math"/>
+                      </w:rPr>
+                      <m:t>1</m:t>
+                    </m:r>
+                    <m:r>
+                      <w:rPr>
+                        <w:rFonts w:ascii="Cambria Math" w:hAnsi="Cambria Math"/>
+                      </w:rPr>
+                      <m:t xml:space="preserve">, </m:t>
+                    </m:r>
+                    <m:r>
+                      <w:rPr>
+                        <w:rFonts w:ascii="Cambria Math" w:hAnsi="Cambria Math"/>
+                      </w:rPr>
+                      <m:t>20</m:t>
+                    </m:r>
+                  </m:e>
+                </m:d>
+                <m:r>
+                  <w:rPr>
+                    <w:rFonts w:ascii="Cambria Math" w:hAnsi="Cambria Math"/>
+                  </w:rPr>
+                  <m:t>, x∈</m:t>
+                </m:r>
+                <m:r>
+                  <w:rPr>
+                    <w:rFonts w:ascii="Cambria Math" w:hAnsi="Cambria Math"/>
+                  </w:rPr>
+                  <m:t>N</m:t>
+                </m:r>
+              </m:oMath>
+            </m:oMathPara>
+          </w:p>
+        </w:tc>
+      </w:tr>
+      <w:tr>
+        <w:tc>
+          <w:tcPr>
+            <w:tcW w:w="3910" w:type="dxa"/>
+          </w:tcPr>
+          <w:p>
+            <w:r>
+              <w:t>Eliminator_survivalRate</w:t>
+            </w:r>
+          </w:p>
+        </w:tc>
+        <w:tc>
+          <w:tcPr>
+            <w:tcW w:w="1946" w:type="dxa"/>
+          </w:tcPr>
+          <w:p>
+            <w:r>
+              <w:t>Udio jedinki koje preživljavaju u geometrijskom eliminatoru.</w:t>
+            </w:r>
+          </w:p>
+        </w:tc>
+        <w:tc>
+          <w:tcPr>
+            <w:tcW w:w="2922" w:type="dxa"/>
+          </w:tcPr>
+          <w:p>
+            <m:oMathPara>
+              <m:oMath>
+                <m:r>
+                  <w:rPr>
+                    <w:rFonts w:ascii="Cambria Math" w:hAnsi="Cambria Math"/>
+                  </w:rPr>
+                  <m:t>x∈</m:t>
+                </m:r>
+                <m:d>
+                  <m:dPr>
+                    <m:begChr m:val="["/>
+                    <m:endChr m:val="]"/>
+                    <m:ctrlPr>
+                      <w:rPr>
+                        <w:rFonts w:ascii="Cambria Math" w:hAnsi="Cambria Math"/>
+                        <w:i/>
+                      </w:rPr>
+                    </m:ctrlPr>
+                  </m:dPr>
+                  <m:e>
+                    <m:r>
+                      <w:rPr>
+                        <w:rFonts w:ascii="Cambria Math" w:hAnsi="Cambria Math"/>
+                      </w:rPr>
+                      <m:t>0.05</m:t>
+                    </m:r>
+                    <m:r>
+                      <w:rPr>
+                        <w:rFonts w:ascii="Cambria Math" w:hAnsi="Cambria Math"/>
+                      </w:rPr>
+                      <m:t xml:space="preserve">, </m:t>
+                    </m:r>
+                    <m:r>
+                      <w:rPr>
+                        <w:rFonts w:ascii="Cambria Math" w:hAnsi="Cambria Math"/>
+                      </w:rPr>
+                      <m:t>0.5</m:t>
+                    </m:r>
+                  </m:e>
+                </m:d>
+                <m:r>
+                  <w:rPr>
+                    <w:rFonts w:ascii="Cambria Math" w:hAnsi="Cambria Math"/>
+                  </w:rPr>
+                  <m:t>, x∈</m:t>
+                </m:r>
+                <m:r>
+                  <w:rPr>
+                    <w:rFonts w:ascii="Cambria Math" w:hAnsi="Cambria Math"/>
+                  </w:rPr>
+                  <m:t>R</m:t>
+                </m:r>
+              </m:oMath>
+            </m:oMathPara>
+          </w:p>
+        </w:tc>
+      </w:tr>
+      <w:tr>
+        <w:tc>
+          <w:tcPr>
+            <w:tcW w:w="3910" w:type="dxa"/>
+          </w:tcPr>
+          <w:p>
+            <w:r>
+              <w:t>Eliminator_p</w:t>
+            </w:r>
+          </w:p>
+        </w:tc>
+        <w:tc>
+          <w:tcPr>
+            <w:tcW w:w="1946" w:type="dxa"/>
+          </w:tcPr>
+          <w:p>
+            <w:r>
+              <w:t>Vjerojatnost korištena kod geometrijske distribucije u geometrijskom eliminatoru</w:t>
+            </w:r>
+          </w:p>
+        </w:tc>
+        <w:tc>
+          <w:tcPr>
+            <w:tcW w:w="2922" w:type="dxa"/>
+          </w:tcPr>
+          <w:p>
+            <w:pPr>
+              <w:tabs>
+                <w:tab w:val="left" w:pos="905"/>
+              </w:tabs>
+            </w:pPr>
+            <m:oMathPara>
+              <m:oMath>
+                <m:r>
+                  <w:rPr>
+                    <w:rFonts w:ascii="Cambria Math" w:hAnsi="Cambria Math"/>
+                  </w:rPr>
+                  <m:t>x∈</m:t>
+                </m:r>
+                <m:d>
+                  <m:dPr>
+                    <m:begChr m:val="["/>
+                    <m:endChr m:val="]"/>
+                    <m:ctrlPr>
+                      <w:rPr>
+                        <w:rFonts w:ascii="Cambria Math" w:hAnsi="Cambria Math"/>
+                        <w:i/>
+                      </w:rPr>
+                    </m:ctrlPr>
+                  </m:dPr>
+                  <m:e>
+                    <m:r>
+                      <w:rPr>
+                        <w:rFonts w:ascii="Cambria Math" w:hAnsi="Cambria Math"/>
+                      </w:rPr>
+                      <m:t>0.</m:t>
+                    </m:r>
+                    <m:r>
+                      <w:rPr>
+                        <w:rFonts w:ascii="Cambria Math" w:hAnsi="Cambria Math"/>
+                      </w:rPr>
+                      <m:t>1</m:t>
+                    </m:r>
+                    <m:r>
+                      <w:rPr>
+                        <w:rFonts w:ascii="Cambria Math" w:hAnsi="Cambria Math"/>
+                      </w:rPr>
+                      <m:t>, 0.</m:t>
+                    </m:r>
+                    <m:r>
+                      <w:rPr>
+                        <w:rFonts w:ascii="Cambria Math" w:hAnsi="Cambria Math"/>
+                      </w:rPr>
+                      <m:t>95</m:t>
+                    </m:r>
+                  </m:e>
+                </m:d>
+                <m:r>
+                  <w:rPr>
+                    <w:rFonts w:ascii="Cambria Math" w:hAnsi="Cambria Math"/>
+                  </w:rPr>
+                  <m:t>, x∈</m:t>
+                </m:r>
+                <m:r>
+                  <w:rPr>
+                    <w:rFonts w:ascii="Cambria Math" w:hAnsi="Cambria Math"/>
+                  </w:rPr>
+                  <m:t>R</m:t>
+                </m:r>
+              </m:oMath>
+            </m:oMathPara>
+          </w:p>
+        </w:tc>
+      </w:tr>
+      <w:tr>
+        <w:tc>
+          <w:tcPr>
+            <w:tcW w:w="3910" w:type="dxa"/>
+          </w:tcPr>
+          <w:p>
+            <w:r>
+              <w:t>Mutator_child1_numMutations</w:t>
+            </w:r>
+          </w:p>
+        </w:tc>
+        <w:tc>
+          <w:tcPr>
+            <w:tcW w:w="1946" w:type="dxa"/>
+          </w:tcPr>
+          <w:p>
+            <w:r>
+              <w:t>Broj mutacija prvog mutatora</w:t>
+            </w:r>
+          </w:p>
+        </w:tc>
+        <w:tc>
+          <w:tcPr>
+            <w:tcW w:w="2922" w:type="dxa"/>
+          </w:tcPr>
+          <w:p>
+            <w:pPr>
+              <w:jc w:val="center"/>
+            </w:pPr>
+            <m:oMathPara>
+              <m:oMath>
+                <m:r>
+                  <w:rPr>
+                    <w:rFonts w:ascii="Cambria Math" w:hAnsi="Cambria Math"/>
+                  </w:rPr>
+                  <m:t>x∈</m:t>
+                </m:r>
+                <m:d>
+                  <m:dPr>
+                    <m:begChr m:val="["/>
+                    <m:endChr m:val="]"/>
+                    <m:ctrlPr>
+                      <w:rPr>
+                        <w:rFonts w:ascii="Cambria Math" w:hAnsi="Cambria Math"/>
+                        <w:i/>
+                      </w:rPr>
+                    </m:ctrlPr>
+                  </m:dPr>
+                  <m:e>
+                    <m:r>
+                      <w:rPr>
+                        <w:rFonts w:ascii="Cambria Math" w:hAnsi="Cambria Math"/>
+                      </w:rPr>
+                      <m:t>1</m:t>
+                    </m:r>
+                    <m:r>
+                      <w:rPr>
+                        <w:rFonts w:ascii="Cambria Math" w:hAnsi="Cambria Math"/>
+                      </w:rPr>
+                      <m:t xml:space="preserve">, </m:t>
+                    </m:r>
+                    <m:r>
+                      <w:rPr>
+                        <w:rFonts w:ascii="Cambria Math" w:hAnsi="Cambria Math"/>
+                      </w:rPr>
+                      <m:t>10</m:t>
+                    </m:r>
+                  </m:e>
+                </m:d>
+                <m:r>
+                  <w:rPr>
+                    <w:rFonts w:ascii="Cambria Math" w:hAnsi="Cambria Math"/>
+                  </w:rPr>
+                  <m:t>, x∈</m:t>
+                </m:r>
+                <m:r>
+                  <w:rPr>
+                    <w:rFonts w:ascii="Cambria Math" w:hAnsi="Cambria Math"/>
+                  </w:rPr>
+                  <m:t>N</m:t>
+                </m:r>
+              </m:oMath>
+            </m:oMathPara>
+          </w:p>
+        </w:tc>
+      </w:tr>
+      <w:tr>
+        <w:tc>
+          <w:tcPr>
+            <w:tcW w:w="3910" w:type="dxa"/>
+          </w:tcPr>
+          <w:p>
+            <w:r>
+              <w:t>Mutator_child</w:t>
+            </w:r>
+            <w:r>
+              <w:t>2</w:t>
+            </w:r>
+            <w:r>
+              <w:t>_numMutations</w:t>
+            </w:r>
+          </w:p>
+        </w:tc>
+        <w:tc>
+          <w:tcPr>
+            <w:tcW w:w="1946" w:type="dxa"/>
+          </w:tcPr>
+          <w:p>
+            <w:r>
+              <w:t>Broj mutacija drugog mutatora</w:t>
+            </w:r>
+          </w:p>
+        </w:tc>
+        <w:tc>
+          <w:tcPr>
+            <w:tcW w:w="2922" w:type="dxa"/>
+          </w:tcPr>
+          <w:p>
+            <m:oMathPara>
+              <m:oMath>
+                <m:r>
+                  <w:rPr>
+                    <w:rFonts w:ascii="Cambria Math" w:hAnsi="Cambria Math"/>
+                  </w:rPr>
+                  <m:t>x∈</m:t>
+                </m:r>
+                <m:d>
+                  <m:dPr>
+                    <m:begChr m:val="["/>
+                    <m:endChr m:val="]"/>
+                    <m:ctrlPr>
+                      <w:rPr>
+                        <w:rFonts w:ascii="Cambria Math" w:hAnsi="Cambria Math"/>
+                        <w:i/>
+                      </w:rPr>
+                    </m:ctrlPr>
+                  </m:dPr>
+                  <m:e>
+                    <m:r>
+                      <w:rPr>
+                        <w:rFonts w:ascii="Cambria Math" w:hAnsi="Cambria Math"/>
+                      </w:rPr>
+                      <m:t>5</m:t>
+                    </m:r>
+                    <m:r>
+                      <w:rPr>
+                        <w:rFonts w:ascii="Cambria Math" w:hAnsi="Cambria Math"/>
+                      </w:rPr>
+                      <m:t xml:space="preserve">, </m:t>
+                    </m:r>
+                    <m:r>
+                      <w:rPr>
+                        <w:rFonts w:ascii="Cambria Math" w:hAnsi="Cambria Math"/>
+                      </w:rPr>
+                      <m:t>20</m:t>
+                    </m:r>
+                  </m:e>
+                </m:d>
+                <m:r>
+                  <w:rPr>
+                    <w:rFonts w:ascii="Cambria Math" w:hAnsi="Cambria Math"/>
+                  </w:rPr>
+                  <m:t>, x∈</m:t>
+                </m:r>
+                <m:r>
+                  <w:rPr>
+                    <w:rFonts w:ascii="Cambria Math" w:hAnsi="Cambria Math"/>
+                  </w:rPr>
+                  <m:t>N</m:t>
+                </m:r>
+              </m:oMath>
+            </m:oMathPara>
+          </w:p>
+        </w:tc>
+      </w:tr>
+      <w:tr>
+        <w:tc>
+          <w:tcPr>
+            <w:tcW w:w="3910" w:type="dxa"/>
+          </w:tcPr>
+          <w:p>
+            <w:r>
+              <w:t>Mutator_child1_</w:t>
+            </w:r>
+            <w:r>
+              <w:t>p</w:t>
+            </w:r>
+          </w:p>
+        </w:tc>
+        <w:tc>
+          <w:tcPr>
+            <w:tcW w:w="1946" w:type="dxa"/>
+          </w:tcPr>
+          <w:p>
+            <w:r>
+              <w:t>Vjerojatnost mutacije prvog mutatora</w:t>
+            </w:r>
+          </w:p>
+        </w:tc>
+        <w:tc>
+          <w:tcPr>
+            <w:tcW w:w="2922" w:type="dxa"/>
+          </w:tcPr>
+          <w:p>
+            <m:oMathPara>
+              <m:oMath>
+                <m:r>
+                  <w:rPr>
+                    <w:rFonts w:ascii="Cambria Math" w:hAnsi="Cambria Math"/>
+                  </w:rPr>
+                  <m:t>x∈</m:t>
+                </m:r>
+                <m:d>
+                  <m:dPr>
+                    <m:begChr m:val="["/>
+                    <m:endChr m:val="]"/>
+                    <m:ctrlPr>
+                      <w:rPr>
+                        <w:rFonts w:ascii="Cambria Math" w:hAnsi="Cambria Math"/>
+                        <w:i/>
+                      </w:rPr>
+                    </m:ctrlPr>
+                  </m:dPr>
+                  <m:e>
+                    <m:r>
+                      <w:rPr>
+                        <w:rFonts w:ascii="Cambria Math" w:hAnsi="Cambria Math"/>
+                      </w:rPr>
+                      <m:t>0.1</m:t>
+                    </m:r>
+                    <m:r>
+                      <w:rPr>
+                        <w:rFonts w:ascii="Cambria Math" w:hAnsi="Cambria Math"/>
+                      </w:rPr>
+                      <m:t xml:space="preserve">, </m:t>
+                    </m:r>
+                    <m:r>
+                      <w:rPr>
+                        <w:rFonts w:ascii="Cambria Math" w:hAnsi="Cambria Math"/>
+                      </w:rPr>
+                      <m:t>0.9</m:t>
+                    </m:r>
+                  </m:e>
+                </m:d>
+                <m:r>
+                  <w:rPr>
+                    <w:rFonts w:ascii="Cambria Math" w:hAnsi="Cambria Math"/>
+                  </w:rPr>
+                  <m:t>, x∈</m:t>
+                </m:r>
+                <m:r>
+                  <w:rPr>
+                    <w:rFonts w:ascii="Cambria Math" w:hAnsi="Cambria Math"/>
+                  </w:rPr>
+                  <m:t>R</m:t>
+                </m:r>
+              </m:oMath>
+            </m:oMathPara>
+          </w:p>
+        </w:tc>
+      </w:tr>
+      <w:tr>
+        <w:tc>
+          <w:tcPr>
+            <w:tcW w:w="3910" w:type="dxa"/>
+          </w:tcPr>
+          <w:p>
+            <w:r>
+              <w:t>Mutator_child</w:t>
+            </w:r>
+            <w:r>
+              <w:t>2</w:t>
+            </w:r>
+            <w:r>
+              <w:t>_p</w:t>
+            </w:r>
+          </w:p>
+        </w:tc>
+        <w:tc>
+          <w:tcPr>
+            <w:tcW w:w="1946" w:type="dxa"/>
+          </w:tcPr>
+          <w:p>
+            <w:r>
+              <w:t xml:space="preserve">Vjerojatnost mutacije </w:t>
+            </w:r>
+            <w:r>
+              <w:t>drugog</w:t>
+            </w:r>
+            <w:r>
+              <w:t xml:space="preserve"> mutatora</w:t>
+            </w:r>
+          </w:p>
+        </w:tc>
+        <w:tc>
+          <w:tcPr>
+            <w:tcW w:w="2922" w:type="dxa"/>
+          </w:tcPr>
+          <w:p>
+            <m:oMathPara>
+              <m:oMath>
+                <m:r>
+                  <w:rPr>
+                    <w:rFonts w:ascii="Cambria Math" w:hAnsi="Cambria Math"/>
+                  </w:rPr>
+                  <m:t>x∈</m:t>
+                </m:r>
+                <m:d>
+                  <m:dPr>
+                    <m:begChr m:val="["/>
+                    <m:endChr m:val="]"/>
+                    <m:ctrlPr>
+                      <w:rPr>
+                        <w:rFonts w:ascii="Cambria Math" w:hAnsi="Cambria Math"/>
+                        <w:i/>
+                      </w:rPr>
+                    </m:ctrlPr>
+                  </m:dPr>
+                  <m:e>
+                    <m:r>
+                      <w:rPr>
+                        <w:rFonts w:ascii="Cambria Math" w:hAnsi="Cambria Math"/>
+                      </w:rPr>
+                      <m:t>0.1, 0.9</m:t>
+                    </m:r>
+                  </m:e>
+                </m:d>
+                <m:r>
+                  <w:rPr>
+                    <w:rFonts w:ascii="Cambria Math" w:hAnsi="Cambria Math"/>
+                  </w:rPr>
+                  <m:t>, x∈</m:t>
+                </m:r>
+                <m:r>
+                  <w:rPr>
+                    <w:rFonts w:ascii="Cambria Math" w:hAnsi="Cambria Math"/>
+                  </w:rPr>
+                  <m:t>R</m:t>
+                </m:r>
+              </m:oMath>
+            </m:oMathPara>
+          </w:p>
+        </w:tc>
+      </w:tr>
+      <w:tr>
+        <w:tc>
+          <w:tcPr>
+            <w:tcW w:w="3910" w:type="dxa"/>
+          </w:tcPr>
+          <w:p>
+            <w:r>
+              <w:lastRenderedPageBreak/>
+              <w:t>Mutator_child1_weight</w:t>
+            </w:r>
+          </w:p>
+        </w:tc>
+        <w:tc>
+          <w:tcPr>
+            <w:tcW w:w="1946" w:type="dxa"/>
+          </w:tcPr>
+          <w:p>
+            <w:r>
+              <w:t>Vjerojatnost odabira prvog mutatora</w:t>
+            </w:r>
+          </w:p>
+        </w:tc>
+        <w:tc>
+          <w:tcPr>
+            <w:tcW w:w="2922" w:type="dxa"/>
+          </w:tcPr>
+          <w:p>
+            <m:oMathPara>
+              <m:oMath>
+                <m:r>
+                  <w:rPr>
+                    <w:rFonts w:ascii="Cambria Math" w:hAnsi="Cambria Math"/>
+                  </w:rPr>
+                  <m:t>x∈</m:t>
+                </m:r>
+                <m:d>
+                  <m:dPr>
+                    <m:begChr m:val="["/>
+                    <m:endChr m:val="]"/>
+                    <m:ctrlPr>
+                      <w:rPr>
+                        <w:rFonts w:ascii="Cambria Math" w:hAnsi="Cambria Math"/>
+                        <w:i/>
+                      </w:rPr>
+                    </m:ctrlPr>
+                  </m:dPr>
+                  <m:e>
+                    <m:r>
+                      <w:rPr>
+                        <w:rFonts w:ascii="Cambria Math" w:hAnsi="Cambria Math"/>
+                      </w:rPr>
+                      <m:t xml:space="preserve">0, </m:t>
+                    </m:r>
+                    <m:r>
+                      <w:rPr>
+                        <w:rFonts w:ascii="Cambria Math" w:hAnsi="Cambria Math"/>
+                      </w:rPr>
+                      <m:t>10</m:t>
+                    </m:r>
+                  </m:e>
+                </m:d>
+                <m:r>
+                  <w:rPr>
+                    <w:rFonts w:ascii="Cambria Math" w:hAnsi="Cambria Math"/>
+                  </w:rPr>
+                  <m:t>, x∈</m:t>
+                </m:r>
+                <m:r>
+                  <w:rPr>
+                    <w:rFonts w:ascii="Cambria Math" w:hAnsi="Cambria Math"/>
+                  </w:rPr>
+                  <m:t>R</m:t>
+                </m:r>
+              </m:oMath>
+            </m:oMathPara>
+          </w:p>
+        </w:tc>
+      </w:tr>
+      <w:tr>
+        <w:tc>
+          <w:tcPr>
+            <w:tcW w:w="3910" w:type="dxa"/>
+          </w:tcPr>
+          <w:p>
+            <w:r>
+              <w:t>Mutator_child</w:t>
+            </w:r>
+            <w:r>
+              <w:t>2</w:t>
+            </w:r>
+            <w:r>
+              <w:t>_weight</w:t>
+            </w:r>
+          </w:p>
+        </w:tc>
+        <w:tc>
+          <w:tcPr>
+            <w:tcW w:w="1946" w:type="dxa"/>
+          </w:tcPr>
+          <w:p>
+            <w:r>
+              <w:t xml:space="preserve">Vjerojatnost odabira </w:t>
+            </w:r>
+            <w:r>
+              <w:t>drugog</w:t>
+            </w:r>
+            <w:r>
+              <w:t xml:space="preserve"> mutatora</w:t>
+            </w:r>
+          </w:p>
+        </w:tc>
+        <w:tc>
+          <w:tcPr>
+            <w:tcW w:w="2922" w:type="dxa"/>
+          </w:tcPr>
+          <w:p>
+            <m:oMathPara>
+              <m:oMath>
+                <m:r>
+                  <w:rPr>
+                    <w:rFonts w:ascii="Cambria Math" w:hAnsi="Cambria Math"/>
+                  </w:rPr>
+                  <m:t>x∈</m:t>
+                </m:r>
+                <m:d>
+                  <m:dPr>
+                    <m:begChr m:val="["/>
+                    <m:endChr m:val="]"/>
+                    <m:ctrlPr>
+                      <w:rPr>
+                        <w:rFonts w:ascii="Cambria Math" w:hAnsi="Cambria Math"/>
+                        <w:i/>
+                      </w:rPr>
+                    </m:ctrlPr>
+                  </m:dPr>
+                  <m:e>
+                    <m:r>
+                      <w:rPr>
+                        <w:rFonts w:ascii="Cambria Math" w:hAnsi="Cambria Math"/>
+                      </w:rPr>
+                      <m:t>0, 10</m:t>
+                    </m:r>
+                  </m:e>
+                </m:d>
+                <m:r>
+                  <w:rPr>
+                    <w:rFonts w:ascii="Cambria Math" w:hAnsi="Cambria Math"/>
+                  </w:rPr>
+                  <m:t>, x∈</m:t>
+                </m:r>
+                <m:r>
+                  <w:rPr>
+                    <w:rFonts w:ascii="Cambria Math" w:hAnsi="Cambria Math"/>
+                  </w:rPr>
+                  <m:t>R</m:t>
+                </m:r>
+              </m:oMath>
+            </m:oMathPara>
+          </w:p>
+        </w:tc>
+      </w:tr>
+      <w:tr>
+        <w:tc>
+          <w:tcPr>
+            <w:tcW w:w="0" w:type="auto"/>
+            <w:hideMark/>
+          </w:tcPr>
+          <w:p>
+            <w:pPr>
+              <w:rPr>
+                <w:lang w:val="en-US"/>
+              </w:rPr>
+            </w:pPr>
+            <w:r>
+              <w:rPr>
+                <w:lang w:val="en-US"/>
+              </w:rPr>
+              <w:t>crossover_child1_geoP</w:t>
+            </w:r>
+          </w:p>
+        </w:tc>
+        <w:tc>
+          <w:tcPr>
+            <w:tcW w:w="0" w:type="auto"/>
+            <w:hideMark/>
+          </w:tcPr>
+          <w:p>
+            <w:pPr>
+              <w:rPr>
+                <w:lang w:val="en-US"/>
+              </w:rPr>
+            </w:pPr>
+            <w:r>
+              <w:rPr>
+                <w:lang w:val="en-US"/>
+              </w:rPr>
+              <w:t xml:space="preserve">Parametar </w:t>
+            </w:r>
+            <w:r>
+              <w:rPr>
+                <w:lang w:val="en-US"/>
+              </w:rPr>
+              <w:t>geometrijske distribucije geometrijskog križanja po stupcima</w:t>
+            </w:r>
+          </w:p>
+        </w:tc>
+        <w:tc>
+          <w:tcPr>
+            <w:tcW w:w="0" w:type="auto"/>
+            <w:hideMark/>
+          </w:tcPr>
+          <w:p>
+            <w:pPr>
+              <w:rPr>
+                <w:lang w:val="en-US"/>
+              </w:rPr>
+            </w:pPr>
+            <m:oMathPara>
+              <m:oMath>
+                <m:r>
+                  <w:rPr>
+                    <w:rFonts w:ascii="Cambria Math" w:hAnsi="Cambria Math"/>
+                  </w:rPr>
+                  <m:t>x∈</m:t>
+                </m:r>
+                <m:d>
+                  <m:dPr>
+                    <m:begChr m:val="["/>
+                    <m:endChr m:val="]"/>
+                    <m:ctrlPr>
+                      <w:rPr>
+                        <w:rFonts w:ascii="Cambria Math" w:hAnsi="Cambria Math"/>
+                        <w:i/>
+                      </w:rPr>
+                    </m:ctrlPr>
+                  </m:dPr>
+                  <m:e>
+                    <m:r>
+                      <w:rPr>
+                        <w:rFonts w:ascii="Cambria Math" w:hAnsi="Cambria Math"/>
+                      </w:rPr>
+                      <m:t>0.1, 0.8</m:t>
+                    </m:r>
+                  </m:e>
+                </m:d>
+                <m:r>
+                  <w:rPr>
+                    <w:rFonts w:ascii="Cambria Math" w:hAnsi="Cambria Math"/>
+                  </w:rPr>
+                  <m:t>, x∈</m:t>
+                </m:r>
+                <m:r>
+                  <w:rPr>
+                    <w:rFonts w:ascii="Cambria Math" w:hAnsi="Cambria Math"/>
+                  </w:rPr>
+                  <m:t>R</m:t>
+                </m:r>
+              </m:oMath>
+            </m:oMathPara>
+          </w:p>
+        </w:tc>
+      </w:tr>
+      <w:tr>
+        <w:tc>
+          <w:tcPr>
+            <w:tcW w:w="0" w:type="auto"/>
+            <w:hideMark/>
+          </w:tcPr>
+          <w:p>
+            <w:pPr>
+              <w:rPr>
+                <w:lang w:val="en-US"/>
+              </w:rPr>
+            </w:pPr>
+            <w:r>
+              <w:rPr>
+                <w:lang w:val="en-US"/>
+              </w:rPr>
+              <w:t>crossover_child1_crossoverProb</w:t>
+            </w:r>
+          </w:p>
+        </w:tc>
+        <w:tc>
+          <w:tcPr>
+            <w:tcW w:w="0" w:type="auto"/>
+            <w:hideMark/>
+          </w:tcPr>
+          <w:p>
+            <w:pPr>
+              <w:rPr>
+                <w:lang w:val="en-US"/>
+              </w:rPr>
+            </w:pPr>
+            <w:r>
+              <w:rPr>
+                <w:lang w:val="en-US"/>
+              </w:rPr>
+              <w:t>Vjerojatnost križanja prvog križara</w:t>
+            </w:r>
+          </w:p>
+        </w:tc>
+        <w:tc>
+          <w:tcPr>
+            <w:tcW w:w="0" w:type="auto"/>
+            <w:hideMark/>
+          </w:tcPr>
+          <w:p>
+            <w:pPr>
+              <w:rPr>
+                <w:lang w:val="en-US"/>
+              </w:rPr>
+            </w:pPr>
+            <m:oMathPara>
+              <m:oMath>
+                <m:r>
+                  <w:rPr>
+                    <w:rFonts w:ascii="Cambria Math" w:hAnsi="Cambria Math"/>
+                  </w:rPr>
+                  <m:t>x∈</m:t>
+                </m:r>
+                <m:d>
+                  <m:dPr>
+                    <m:begChr m:val="["/>
+                    <m:endChr m:val="]"/>
+                    <m:ctrlPr>
+                      <w:rPr>
+                        <w:rFonts w:ascii="Cambria Math" w:hAnsi="Cambria Math"/>
+                        <w:i/>
+                      </w:rPr>
+                    </m:ctrlPr>
+                  </m:dPr>
+                  <m:e>
+                    <m:r>
+                      <w:rPr>
+                        <w:rFonts w:ascii="Cambria Math" w:hAnsi="Cambria Math"/>
+                      </w:rPr>
+                      <m:t>0, 10</m:t>
+                    </m:r>
+                  </m:e>
+                </m:d>
+                <m:r>
+                  <w:rPr>
+                    <w:rFonts w:ascii="Cambria Math" w:hAnsi="Cambria Math"/>
+                  </w:rPr>
+                  <m:t>, x∈</m:t>
+                </m:r>
+                <m:r>
+                  <w:rPr>
+                    <w:rFonts w:ascii="Cambria Math" w:hAnsi="Cambria Math"/>
+                  </w:rPr>
+                  <m:t>R</m:t>
+                </m:r>
+              </m:oMath>
+            </m:oMathPara>
+          </w:p>
+        </w:tc>
+      </w:tr>
+      <w:tr>
+        <w:tc>
+          <w:tcPr>
+            <w:tcW w:w="0" w:type="auto"/>
+            <w:hideMark/>
+          </w:tcPr>
+          <w:p>
+            <w:pPr>
+              <w:rPr>
+                <w:lang w:val="en-US"/>
+              </w:rPr>
+            </w:pPr>
+            <w:r>
+              <w:rPr>
+                <w:lang w:val="en-US"/>
+              </w:rPr>
+              <w:t>crossover_child1_weight</w:t>
+            </w:r>
+          </w:p>
+        </w:tc>
+        <w:tc>
+          <w:tcPr>
+            <w:tcW w:w="0" w:type="auto"/>
+            <w:hideMark/>
+          </w:tcPr>
+          <w:p>
+            <w:pPr>
+              <w:rPr>
+                <w:lang w:val="en-US"/>
+              </w:rPr>
+            </w:pPr>
+            <w:r>
+              <w:rPr>
+                <w:lang w:val="en-US"/>
+              </w:rPr>
+              <w:t>Vjerojatnost odabira prvog križara</w:t>
+            </w:r>
+          </w:p>
+        </w:tc>
+        <w:tc>
+          <w:tcPr>
+            <w:tcW w:w="0" w:type="auto"/>
+            <w:hideMark/>
+          </w:tcPr>
+          <w:p>
+            <w:pPr>
+              <w:rPr>
+                <w:lang w:val="en-US"/>
+              </w:rPr>
+            </w:pPr>
+            <m:oMathPara>
+              <m:oMath>
+                <m:r>
+                  <w:rPr>
+                    <w:rFonts w:ascii="Cambria Math" w:hAnsi="Cambria Math"/>
+                  </w:rPr>
+                  <m:t>x∈</m:t>
+                </m:r>
+                <m:d>
+                  <m:dPr>
+                    <m:begChr m:val="["/>
+                    <m:endChr m:val="]"/>
+                    <m:ctrlPr>
+                      <w:rPr>
+                        <w:rFonts w:ascii="Cambria Math" w:hAnsi="Cambria Math"/>
+                        <w:i/>
+                      </w:rPr>
+                    </m:ctrlPr>
+                  </m:dPr>
+                  <m:e>
+                    <m:r>
+                      <w:rPr>
+                        <w:rFonts w:ascii="Cambria Math" w:hAnsi="Cambria Math"/>
+                      </w:rPr>
+                      <m:t>0, 10</m:t>
+                    </m:r>
+                  </m:e>
+                </m:d>
+                <m:r>
+                  <w:rPr>
+                    <w:rFonts w:ascii="Cambria Math" w:hAnsi="Cambria Math"/>
+                  </w:rPr>
+                  <m:t>, x∈</m:t>
+                </m:r>
+                <m:r>
+                  <w:rPr>
+                    <w:rFonts w:ascii="Cambria Math" w:hAnsi="Cambria Math"/>
+                  </w:rPr>
+                  <m:t>R</m:t>
+                </m:r>
+              </m:oMath>
+            </m:oMathPara>
+          </w:p>
+        </w:tc>
+      </w:tr>
+      <w:tr>
+        <w:tc>
+          <w:tcPr>
+            <w:tcW w:w="0" w:type="auto"/>
+            <w:hideMark/>
+          </w:tcPr>
+          <w:p>
+            <w:pPr>
+              <w:rPr>
+                <w:lang w:val="en-US"/>
+              </w:rPr>
+            </w:pPr>
+            <w:r>
+              <w:rPr>
+                <w:lang w:val="en-US"/>
+              </w:rPr>
+              <w:t>crossover_child2_geoP</w:t>
+            </w:r>
+          </w:p>
+        </w:tc>
+        <w:tc>
+          <w:tcPr>
+            <w:tcW w:w="0" w:type="auto"/>
+            <w:hideMark/>
+          </w:tcPr>
+          <w:p>
+            <w:pPr>
+              <w:rPr>
+                <w:lang w:val="en-US"/>
+              </w:rPr>
+            </w:pPr>
+            <w:r>
+              <w:rPr>
+                <w:lang w:val="en-US"/>
+              </w:rPr>
+              <w:t>Parametar geoP drugog križara</w:t>
+            </w:r>
+          </w:p>
+        </w:tc>
+        <w:tc>
+          <w:tcPr>
+            <w:tcW w:w="0" w:type="auto"/>
+            <w:hideMark/>
+          </w:tcPr>
+          <w:p>
+            <w:pPr>
+              <w:rPr>
+                <w:lang w:val="en-US"/>
+              </w:rPr>
+            </w:pPr>
+            <m:oMathPara>
+              <m:oMath>
+                <m:r>
+                  <w:rPr>
+                    <w:rFonts w:ascii="Cambria Math" w:hAnsi="Cambria Math"/>
+                  </w:rPr>
+                  <m:t>x∈</m:t>
+                </m:r>
+                <m:d>
+                  <m:dPr>
+                    <m:begChr m:val="["/>
+                    <m:endChr m:val="]"/>
+                    <m:ctrlPr>
+                      <w:rPr>
+                        <w:rFonts w:ascii="Cambria Math" w:hAnsi="Cambria Math"/>
+                        <w:i/>
+                      </w:rPr>
+                    </m:ctrlPr>
+                  </m:dPr>
+                  <m:e>
+                    <m:r>
+                      <w:rPr>
+                        <w:rFonts w:ascii="Cambria Math" w:hAnsi="Cambria Math"/>
+                      </w:rPr>
+                      <m:t>0, 10</m:t>
+                    </m:r>
+                  </m:e>
+                </m:d>
+                <m:r>
+                  <w:rPr>
+                    <w:rFonts w:ascii="Cambria Math" w:hAnsi="Cambria Math"/>
+                  </w:rPr>
+                  <m:t>, x∈</m:t>
+                </m:r>
+                <m:r>
+                  <w:rPr>
+                    <w:rFonts w:ascii="Cambria Math" w:hAnsi="Cambria Math"/>
+                  </w:rPr>
+                  <m:t>R</m:t>
+                </m:r>
+              </m:oMath>
+            </m:oMathPara>
+          </w:p>
+        </w:tc>
+      </w:tr>
+      <w:tr>
+        <w:tc>
+          <w:tcPr>
+            <w:tcW w:w="0" w:type="auto"/>
+            <w:hideMark/>
+          </w:tcPr>
+          <w:p>
+            <w:pPr>
+              <w:rPr>
+                <w:lang w:val="en-US"/>
+              </w:rPr>
+            </w:pPr>
+            <w:r>
+              <w:rPr>
+                <w:lang w:val="en-US"/>
+              </w:rPr>
+              <w:t>crossover_child2_crossoverProb</w:t>
+            </w:r>
+          </w:p>
+        </w:tc>
+        <w:tc>
+          <w:tcPr>
+            <w:tcW w:w="0" w:type="auto"/>
+            <w:hideMark/>
+          </w:tcPr>
+          <w:p>
+            <w:pPr>
+              <w:rPr>
+                <w:lang w:val="en-US"/>
+              </w:rPr>
+            </w:pPr>
+            <w:r>
+              <w:rPr>
+                <w:lang w:val="en-US"/>
+              </w:rPr>
+              <w:t>Vjerojatnost križanja drugog križara</w:t>
+            </w:r>
+          </w:p>
+        </w:tc>
+        <w:tc>
+          <w:tcPr>
+            <w:tcW w:w="0" w:type="auto"/>
+            <w:hideMark/>
+          </w:tcPr>
+          <w:p>
+            <w:pPr>
+              <w:rPr>
+                <w:lang w:val="en-US"/>
+              </w:rPr>
+            </w:pPr>
+            <m:oMathPara>
+              <m:oMath>
+                <m:r>
+                  <w:rPr>
+                    <w:rFonts w:ascii="Cambria Math" w:hAnsi="Cambria Math"/>
+                  </w:rPr>
+                  <m:t>x∈</m:t>
+                </m:r>
+                <m:d>
+                  <m:dPr>
+                    <m:begChr m:val="["/>
+                    <m:endChr m:val="]"/>
+                    <m:ctrlPr>
+                      <w:rPr>
+                        <w:rFonts w:ascii="Cambria Math" w:hAnsi="Cambria Math"/>
+                        <w:i/>
+                      </w:rPr>
+                    </m:ctrlPr>
+                  </m:dPr>
+                  <m:e>
+                    <m:r>
+                      <w:rPr>
+                        <w:rFonts w:ascii="Cambria Math" w:hAnsi="Cambria Math"/>
+                      </w:rPr>
+                      <m:t>0, 10</m:t>
+                    </m:r>
+                  </m:e>
+                </m:d>
+                <m:r>
+                  <w:rPr>
+                    <w:rFonts w:ascii="Cambria Math" w:hAnsi="Cambria Math"/>
+                  </w:rPr>
+                  <m:t>, x∈</m:t>
+                </m:r>
+                <m:r>
+                  <w:rPr>
+                    <w:rFonts w:ascii="Cambria Math" w:hAnsi="Cambria Math"/>
+                  </w:rPr>
+                  <m:t>R</m:t>
+                </m:r>
+              </m:oMath>
+            </m:oMathPara>
+          </w:p>
+        </w:tc>
+      </w:tr>
+      <w:tr>
+        <w:tc>
+          <w:tcPr>
+            <w:tcW w:w="0" w:type="auto"/>
+            <w:hideMark/>
+          </w:tcPr>
+          <w:p>
+            <w:pPr>
+              <w:rPr>
+                <w:lang w:val="en-US"/>
+              </w:rPr>
+            </w:pPr>
+            <w:r>
+              <w:rPr>
+                <w:lang w:val="en-US"/>
+              </w:rPr>
+              <w:t>crossover_child2_weight</w:t>
+            </w:r>
+          </w:p>
+        </w:tc>
+        <w:tc>
+          <w:tcPr>
+            <w:tcW w:w="0" w:type="auto"/>
+            <w:hideMark/>
+          </w:tcPr>
+          <w:p>
+            <w:pPr>
+              <w:rPr>
+                <w:lang w:val="en-US"/>
+              </w:rPr>
+            </w:pPr>
+            <w:r>
+              <w:rPr>
+                <w:lang w:val="en-US"/>
+              </w:rPr>
+              <w:t>Vjerojatnost odabira drugog križara</w:t>
+            </w:r>
+          </w:p>
+        </w:tc>
+        <w:tc>
+          <w:tcPr>
+            <w:tcW w:w="0" w:type="auto"/>
+            <w:hideMark/>
+          </w:tcPr>
+          <w:p>
+            <w:pPr>
+              <w:rPr>
+                <w:lang w:val="en-US"/>
+              </w:rPr>
+            </w:pPr>
+            <m:oMathPara>
+              <m:oMath>
+                <m:r>
+                  <w:rPr>
+                    <w:rFonts w:ascii="Cambria Math" w:hAnsi="Cambria Math"/>
+                  </w:rPr>
+                  <m:t>x∈</m:t>
+                </m:r>
+                <m:d>
+                  <m:dPr>
+                    <m:begChr m:val="["/>
+                    <m:endChr m:val="]"/>
+                    <m:ctrlPr>
+                      <w:rPr>
+                        <w:rFonts w:ascii="Cambria Math" w:hAnsi="Cambria Math"/>
+                        <w:i/>
+                      </w:rPr>
+                    </m:ctrlPr>
+                  </m:dPr>
+                  <m:e>
+                    <m:r>
+                      <w:rPr>
+                        <w:rFonts w:ascii="Cambria Math" w:hAnsi="Cambria Math"/>
+                      </w:rPr>
+                      <m:t>0, 10</m:t>
+                    </m:r>
+                  </m:e>
+                </m:d>
+                <m:r>
+                  <w:rPr>
+                    <w:rFonts w:ascii="Cambria Math" w:hAnsi="Cambria Math"/>
+                  </w:rPr>
+                  <m:t>, x∈</m:t>
+                </m:r>
+                <m:r>
+                  <w:rPr>
+                    <w:rFonts w:ascii="Cambria Math" w:hAnsi="Cambria Math"/>
+                  </w:rPr>
+                  <m:t>R</m:t>
+                </m:r>
+              </m:oMath>
+            </m:oMathPara>
+          </w:p>
+        </w:tc>
+      </w:tr>
+      <w:tr>
+        <w:tc>
+          <w:tcPr>
+            <w:tcW w:w="0" w:type="auto"/>
+            <w:hideMark/>
+          </w:tcPr>
+          <w:p>
+            <w:pPr>
+              <w:rPr>
+                <w:lang w:val="en-US"/>
+              </w:rPr>
+            </w:pPr>
+            <w:r>
+              <w:rPr>
+                <w:lang w:val="en-US"/>
+              </w:rPr>
+              <w:t>crossover_child3_p</w:t>
+            </w:r>
+          </w:p>
+        </w:tc>
+        <w:tc>
+          <w:tcPr>
+            <w:tcW w:w="0" w:type="auto"/>
+            <w:hideMark/>
+          </w:tcPr>
+          <w:p>
+            <w:pPr>
+              <w:rPr>
+                <w:lang w:val="en-US"/>
+              </w:rPr>
+            </w:pPr>
+            <w:r>
+              <w:rPr>
+                <w:lang w:val="en-US"/>
+              </w:rPr>
+              <w:t>Parametar p trećeg križara</w:t>
+            </w:r>
+          </w:p>
+        </w:tc>
+        <w:tc>
+          <w:tcPr>
+            <w:tcW w:w="0" w:type="auto"/>
+            <w:hideMark/>
+          </w:tcPr>
+          <w:p>
+            <w:pPr>
+              <w:rPr>
+                <w:lang w:val="en-US"/>
+              </w:rPr>
+            </w:pPr>
+            <m:oMathPara>
+              <m:oMath>
+                <m:r>
+                  <w:rPr>
+                    <w:rFonts w:ascii="Cambria Math" w:hAnsi="Cambria Math"/>
+                  </w:rPr>
+                  <m:t>x∈</m:t>
+                </m:r>
+                <m:d>
+                  <m:dPr>
+                    <m:begChr m:val="["/>
+                    <m:endChr m:val="]"/>
+                    <m:ctrlPr>
+                      <w:rPr>
+                        <w:rFonts w:ascii="Cambria Math" w:hAnsi="Cambria Math"/>
+                        <w:i/>
+                      </w:rPr>
+                    </m:ctrlPr>
+                  </m:dPr>
+                  <m:e>
+                    <m:r>
+                      <w:rPr>
+                        <w:rFonts w:ascii="Cambria Math" w:hAnsi="Cambria Math"/>
+                      </w:rPr>
+                      <m:t>0, 10</m:t>
+                    </m:r>
+                  </m:e>
+                </m:d>
+                <m:r>
+                  <w:rPr>
+                    <w:rFonts w:ascii="Cambria Math" w:hAnsi="Cambria Math"/>
+                  </w:rPr>
+                  <m:t>, x∈</m:t>
+                </m:r>
+                <m:r>
+                  <w:rPr>
+                    <w:rFonts w:ascii="Cambria Math" w:hAnsi="Cambria Math"/>
+                  </w:rPr>
+                  <m:t>R</m:t>
+                </m:r>
+              </m:oMath>
+            </m:oMathPara>
+          </w:p>
+        </w:tc>
+      </w:tr>
+      <w:tr>
+        <w:tc>
+          <w:tcPr>
+            <w:tcW w:w="0" w:type="auto"/>
+            <w:hideMark/>
+          </w:tcPr>
+          <w:p>
+            <w:pPr>
+              <w:rPr>
+                <w:lang w:val="en-US"/>
+              </w:rPr>
+            </w:pPr>
+            <w:r>
+              <w:rPr>
+                <w:lang w:val="en-US"/>
+              </w:rPr>
+              <w:lastRenderedPageBreak/>
+              <w:t>crossover_child3_weight</w:t>
+            </w:r>
+          </w:p>
+        </w:tc>
+        <w:tc>
+          <w:tcPr>
+            <w:tcW w:w="0" w:type="auto"/>
+            <w:hideMark/>
+          </w:tcPr>
+          <w:p>
+            <w:pPr>
+              <w:rPr>
+                <w:lang w:val="en-US"/>
+              </w:rPr>
+            </w:pPr>
+            <w:r>
+              <w:rPr>
+                <w:lang w:val="en-US"/>
+              </w:rPr>
+              <w:t>Vjerojatnost odabira trećeg križara</w:t>
+            </w:r>
+          </w:p>
+        </w:tc>
+        <w:tc>
+          <w:tcPr>
+            <w:tcW w:w="0" w:type="auto"/>
+            <w:hideMark/>
+          </w:tcPr>
+          <w:p>
+            <w:pPr>
+              <w:rPr>
+                <w:lang w:val="en-US"/>
+              </w:rPr>
+            </w:pPr>
+            <m:oMathPara>
+              <m:oMath>
+                <m:r>
+                  <w:rPr>
+                    <w:rFonts w:ascii="Cambria Math" w:hAnsi="Cambria Math"/>
+                  </w:rPr>
+                  <m:t>x∈</m:t>
+                </m:r>
+                <m:d>
+                  <m:dPr>
+                    <m:begChr m:val="["/>
+                    <m:endChr m:val="]"/>
+                    <m:ctrlPr>
+                      <w:rPr>
+                        <w:rFonts w:ascii="Cambria Math" w:hAnsi="Cambria Math"/>
+                        <w:i/>
+                      </w:rPr>
+                    </m:ctrlPr>
+                  </m:dPr>
+                  <m:e>
+                    <m:r>
+                      <w:rPr>
+                        <w:rFonts w:ascii="Cambria Math" w:hAnsi="Cambria Math"/>
+                      </w:rPr>
+                      <m:t>0, 10</m:t>
+                    </m:r>
+                  </m:e>
+                </m:d>
+                <m:r>
+                  <w:rPr>
+                    <w:rFonts w:ascii="Cambria Math" w:hAnsi="Cambria Math"/>
+                  </w:rPr>
+                  <m:t>, x∈</m:t>
+                </m:r>
+                <m:r>
+                  <w:rPr>
+                    <w:rFonts w:ascii="Cambria Math" w:hAnsi="Cambria Math"/>
+                  </w:rPr>
+                  <m:t>R</m:t>
+                </m:r>
+              </m:oMath>
+            </m:oMathPara>
+          </w:p>
+        </w:tc>
+      </w:tr>
+      <w:tr>
+        <w:tc>
+          <w:tcPr>
+            <w:tcW w:w="0" w:type="auto"/>
+            <w:hideMark/>
+          </w:tcPr>
+          <w:p>
+            <w:pPr>
+              <w:rPr>
+                <w:lang w:val="en-US"/>
+              </w:rPr>
+            </w:pPr>
+            <w:r>
+              <w:rPr>
+                <w:lang w:val="en-US"/>
+              </w:rPr>
+              <w:t>crossover_child4_k</w:t>
+            </w:r>
+          </w:p>
+        </w:tc>
+        <w:tc>
+          <w:tcPr>
+            <w:tcW w:w="0" w:type="auto"/>
+            <w:hideMark/>
+          </w:tcPr>
+          <w:p>
+            <w:pPr>
+              <w:rPr>
+                <w:lang w:val="en-US"/>
+              </w:rPr>
+            </w:pPr>
+            <w:r>
+              <w:rPr>
+                <w:lang w:val="en-US"/>
+              </w:rPr>
+              <w:t>Parametar k četvrtog križara</w:t>
+            </w:r>
+          </w:p>
+        </w:tc>
+        <w:tc>
+          <w:tcPr>
+            <w:tcW w:w="0" w:type="auto"/>
+            <w:hideMark/>
+          </w:tcPr>
+          <w:p>
+            <w:pPr>
+              <w:rPr>
+                <w:lang w:val="en-US"/>
+              </w:rPr>
+            </w:pPr>
+            <m:oMathPara>
+              <m:oMath>
+                <m:r>
+                  <w:rPr>
+                    <w:rFonts w:ascii="Cambria Math" w:hAnsi="Cambria Math"/>
+                  </w:rPr>
+                  <m:t>x∈</m:t>
+                </m:r>
+                <m:d>
+                  <m:dPr>
+                    <m:begChr m:val="["/>
+                    <m:endChr m:val="]"/>
+                    <m:ctrlPr>
+                      <w:rPr>
+                        <w:rFonts w:ascii="Cambria Math" w:hAnsi="Cambria Math"/>
+                        <w:i/>
+                      </w:rPr>
+                    </m:ctrlPr>
+                  </m:dPr>
+                  <m:e>
+                    <m:r>
+                      <w:rPr>
+                        <w:rFonts w:ascii="Cambria Math" w:hAnsi="Cambria Math"/>
+                      </w:rPr>
+                      <m:t>0, 10</m:t>
+                    </m:r>
+                  </m:e>
+                </m:d>
+                <m:r>
+                  <w:rPr>
+                    <w:rFonts w:ascii="Cambria Math" w:hAnsi="Cambria Math"/>
+                  </w:rPr>
+                  <m:t>, x∈</m:t>
+                </m:r>
+                <m:r>
+                  <w:rPr>
+                    <w:rFonts w:ascii="Cambria Math" w:hAnsi="Cambria Math"/>
+                  </w:rPr>
+                  <m:t>R</m:t>
+                </m:r>
+              </m:oMath>
+            </m:oMathPara>
+          </w:p>
+        </w:tc>
+      </w:tr>
+      <w:tr>
+        <w:tc>
+          <w:tcPr>
+            <w:tcW w:w="0" w:type="auto"/>
+            <w:hideMark/>
+          </w:tcPr>
+          <w:p>
+            <w:pPr>
+              <w:rPr>
+                <w:lang w:val="en-US"/>
+              </w:rPr>
+            </w:pPr>
+            <w:r>
+              <w:rPr>
+                <w:lang w:val="en-US"/>
+              </w:rPr>
+              <w:t>crossover_child4_p</w:t>
+            </w:r>
+          </w:p>
+        </w:tc>
+        <w:tc>
+          <w:tcPr>
+            <w:tcW w:w="0" w:type="auto"/>
+            <w:hideMark/>
+          </w:tcPr>
+          <w:p>
+            <w:pPr>
+              <w:rPr>
+                <w:lang w:val="en-US"/>
+              </w:rPr>
+            </w:pPr>
+            <w:r>
+              <w:rPr>
+                <w:lang w:val="en-US"/>
+              </w:rPr>
+              <w:t>Parametar p četvrtog križara</w:t>
+            </w:r>
+          </w:p>
+        </w:tc>
+        <w:tc>
+          <w:tcPr>
+            <w:tcW w:w="0" w:type="auto"/>
+            <w:hideMark/>
+          </w:tcPr>
+          <w:p>
+            <w:pPr>
+              <w:rPr>
+                <w:lang w:val="en-US"/>
+              </w:rPr>
+            </w:pPr>
+            <m:oMathPara>
+              <m:oMath>
+                <m:r>
+                  <w:rPr>
+                    <w:rFonts w:ascii="Cambria Math" w:hAnsi="Cambria Math"/>
+                  </w:rPr>
+                  <m:t>x∈</m:t>
+                </m:r>
+                <m:d>
+                  <m:dPr>
+                    <m:begChr m:val="["/>
+                    <m:endChr m:val="]"/>
+                    <m:ctrlPr>
+                      <w:rPr>
+                        <w:rFonts w:ascii="Cambria Math" w:hAnsi="Cambria Math"/>
+                        <w:i/>
+                      </w:rPr>
+                    </m:ctrlPr>
+                  </m:dPr>
+                  <m:e>
+                    <m:r>
+                      <w:rPr>
+                        <w:rFonts w:ascii="Cambria Math" w:hAnsi="Cambria Math"/>
+                      </w:rPr>
+                      <m:t>0, 10</m:t>
+                    </m:r>
+                  </m:e>
+                </m:d>
+                <m:r>
+                  <w:rPr>
+                    <w:rFonts w:ascii="Cambria Math" w:hAnsi="Cambria Math"/>
+                  </w:rPr>
+                  <m:t>, x∈</m:t>
+                </m:r>
+                <m:r>
+                  <w:rPr>
+                    <w:rFonts w:ascii="Cambria Math" w:hAnsi="Cambria Math"/>
+                  </w:rPr>
+                  <m:t>R</m:t>
+                </m:r>
+              </m:oMath>
+            </m:oMathPara>
+          </w:p>
+        </w:tc>
+      </w:tr>
+      <w:tr>
+        <w:tc>
+          <w:tcPr>
+            <w:tcW w:w="0" w:type="auto"/>
+            <w:hideMark/>
+          </w:tcPr>
+          <w:p>
+            <w:pPr>
+              <w:rPr>
+                <w:lang w:val="en-US"/>
+              </w:rPr>
+            </w:pPr>
+            <w:r>
+              <w:rPr>
+                <w:lang w:val="en-US"/>
+              </w:rPr>
+              <w:t>crossover_child4_weight</w:t>
+            </w:r>
+          </w:p>
+        </w:tc>
+        <w:tc>
+          <w:tcPr>
+            <w:tcW w:w="0" w:type="auto"/>
+            <w:hideMark/>
+          </w:tcPr>
+          <w:p>
+            <w:pPr>
+              <w:rPr>
+                <w:lang w:val="en-US"/>
+              </w:rPr>
+            </w:pPr>
+            <w:r>
+              <w:rPr>
+                <w:lang w:val="en-US"/>
+              </w:rPr>
+              <w:t>Vjerojatnost odabira četvrtog križara</w:t>
+            </w:r>
+          </w:p>
+        </w:tc>
+        <w:tc>
+          <w:tcPr>
+            <w:tcW w:w="0" w:type="auto"/>
+            <w:hideMark/>
+          </w:tcPr>
+          <w:p>
+            <w:pPr>
+              <w:rPr>
+                <w:lang w:val="en-US"/>
+              </w:rPr>
+            </w:pPr>
+            <m:oMathPara>
+              <m:oMath>
+                <m:r>
+                  <w:rPr>
+                    <w:rFonts w:ascii="Cambria Math" w:hAnsi="Cambria Math"/>
+                  </w:rPr>
+                  <m:t>x∈</m:t>
+                </m:r>
+                <m:d>
+                  <m:dPr>
+                    <m:begChr m:val="["/>
+                    <m:endChr m:val="]"/>
+                    <m:ctrlPr>
+                      <w:rPr>
+                        <w:rFonts w:ascii="Cambria Math" w:hAnsi="Cambria Math"/>
+                        <w:i/>
+                      </w:rPr>
+                    </m:ctrlPr>
+                  </m:dPr>
+                  <m:e>
+                    <m:r>
+                      <w:rPr>
+                        <w:rFonts w:ascii="Cambria Math" w:hAnsi="Cambria Math"/>
+                      </w:rPr>
+                      <m:t>0, 10</m:t>
+                    </m:r>
+                  </m:e>
+                </m:d>
+                <m:r>
+                  <w:rPr>
+                    <w:rFonts w:ascii="Cambria Math" w:hAnsi="Cambria Math"/>
+                  </w:rPr>
+                  <m:t>, x∈</m:t>
+                </m:r>
+                <m:r>
+                  <w:rPr>
+                    <w:rFonts w:ascii="Cambria Math" w:hAnsi="Cambria Math"/>
+                  </w:rPr>
+                  <m:t>R</m:t>
+                </m:r>
+              </m:oMath>
+            </m:oMathPara>
+          </w:p>
+        </w:tc>
+      </w:tr>
+      <w:tr>
+        <w:tc>
+          <w:tcPr>
+            <w:tcW w:w="0" w:type="auto"/>
+            <w:hideMark/>
+          </w:tcPr>
+          <w:p>
+            <w:pPr>
+              <w:rPr>
+                <w:lang w:val="en-US"/>
+              </w:rPr>
+            </w:pPr>
+            <w:r>
+              <w:rPr>
+                <w:lang w:val="en-US"/>
+              </w:rPr>
+              <w:t>crossover_child5_k</w:t>
+            </w:r>
+          </w:p>
+        </w:tc>
+        <w:tc>
+          <w:tcPr>
+            <w:tcW w:w="0" w:type="auto"/>
+            <w:hideMark/>
+          </w:tcPr>
+          <w:p>
+            <w:pPr>
+              <w:rPr>
+                <w:lang w:val="en-US"/>
+              </w:rPr>
+            </w:pPr>
+            <w:r>
+              <w:rPr>
+                <w:lang w:val="en-US"/>
+              </w:rPr>
+              <w:t>Parametar k petog križara</w:t>
+            </w:r>
+          </w:p>
+        </w:tc>
+        <w:tc>
+          <w:tcPr>
+            <w:tcW w:w="0" w:type="auto"/>
+            <w:hideMark/>
+          </w:tcPr>
+          <w:p>
+            <w:pPr>
+              <w:rPr>
+                <w:lang w:val="en-US"/>
+              </w:rPr>
+            </w:pPr>
+            <m:oMathPara>
+              <m:oMath>
+                <m:r>
+                  <w:rPr>
+                    <w:rFonts w:ascii="Cambria Math" w:hAnsi="Cambria Math"/>
+                  </w:rPr>
+                  <m:t>x∈</m:t>
+                </m:r>
+                <m:d>
+                  <m:dPr>
+                    <m:begChr m:val="["/>
+                    <m:endChr m:val="]"/>
+                    <m:ctrlPr>
+                      <w:rPr>
+                        <w:rFonts w:ascii="Cambria Math" w:hAnsi="Cambria Math"/>
+                        <w:i/>
+                      </w:rPr>
+                    </m:ctrlPr>
+                  </m:dPr>
+                  <m:e>
+                    <m:r>
+                      <w:rPr>
+                        <w:rFonts w:ascii="Cambria Math" w:hAnsi="Cambria Math"/>
+                      </w:rPr>
+                      <m:t>0, 10</m:t>
+                    </m:r>
+                  </m:e>
+                </m:d>
+                <m:r>
+                  <w:rPr>
+                    <w:rFonts w:ascii="Cambria Math" w:hAnsi="Cambria Math"/>
+                  </w:rPr>
+                  <m:t>, x∈</m:t>
+                </m:r>
+                <m:r>
+                  <w:rPr>
+                    <w:rFonts w:ascii="Cambria Math" w:hAnsi="Cambria Math"/>
+                  </w:rPr>
+                  <m:t>R</m:t>
+                </m:r>
+              </m:oMath>
+            </m:oMathPara>
+          </w:p>
+        </w:tc>
+      </w:tr>
+      <w:tr>
+        <w:tc>
+          <w:tcPr>
+            <w:tcW w:w="0" w:type="auto"/>
+            <w:hideMark/>
+          </w:tcPr>
+          <w:p>
+            <w:pPr>
+              <w:rPr>
+                <w:lang w:val="en-US"/>
+              </w:rPr>
+            </w:pPr>
+            <w:r>
+              <w:rPr>
+                <w:lang w:val="en-US"/>
+              </w:rPr>
+              <w:t>crossover_child5_p</w:t>
+            </w:r>
+          </w:p>
+        </w:tc>
+        <w:tc>
+          <w:tcPr>
+            <w:tcW w:w="0" w:type="auto"/>
+            <w:hideMark/>
+          </w:tcPr>
+          <w:p>
+            <w:pPr>
+              <w:rPr>
+                <w:lang w:val="en-US"/>
+              </w:rPr>
+            </w:pPr>
+            <w:r>
+              <w:rPr>
+                <w:lang w:val="en-US"/>
+              </w:rPr>
+              <w:t>Parametar p petog križara</w:t>
+            </w:r>
+          </w:p>
+        </w:tc>
+        <w:tc>
+          <w:tcPr>
+            <w:tcW w:w="0" w:type="auto"/>
+            <w:hideMark/>
+          </w:tcPr>
+          <w:p>
+            <w:pPr>
+              <w:rPr>
+                <w:lang w:val="en-US"/>
+              </w:rPr>
+            </w:pPr>
+            <m:oMathPara>
+              <m:oMath>
+                <m:r>
+                  <w:rPr>
+                    <w:rFonts w:ascii="Cambria Math" w:hAnsi="Cambria Math"/>
+                  </w:rPr>
+                  <m:t>x∈</m:t>
+                </m:r>
+                <m:d>
+                  <m:dPr>
+                    <m:begChr m:val="["/>
+                    <m:endChr m:val="]"/>
+                    <m:ctrlPr>
+                      <w:rPr>
+                        <w:rFonts w:ascii="Cambria Math" w:hAnsi="Cambria Math"/>
+                        <w:i/>
+                      </w:rPr>
+                    </m:ctrlPr>
+                  </m:dPr>
+                  <m:e>
+                    <m:r>
+                      <w:rPr>
+                        <w:rFonts w:ascii="Cambria Math" w:hAnsi="Cambria Math"/>
+                      </w:rPr>
+                      <m:t>0, 10</m:t>
+                    </m:r>
+                  </m:e>
+                </m:d>
+                <m:r>
+                  <w:rPr>
+                    <w:rFonts w:ascii="Cambria Math" w:hAnsi="Cambria Math"/>
+                  </w:rPr>
+                  <m:t>, x∈</m:t>
+                </m:r>
+                <m:r>
+                  <w:rPr>
+                    <w:rFonts w:ascii="Cambria Math" w:hAnsi="Cambria Math"/>
+                  </w:rPr>
+                  <m:t>R</m:t>
+                </m:r>
+              </m:oMath>
+            </m:oMathPara>
+          </w:p>
+        </w:tc>
+      </w:tr>
+      <w:tr>
+        <w:tc>
+          <w:tcPr>
+            <w:tcW w:w="0" w:type="auto"/>
+            <w:hideMark/>
+          </w:tcPr>
+          <w:p>
+            <w:pPr>
+              <w:rPr>
+                <w:lang w:val="en-US"/>
+              </w:rPr>
+            </w:pPr>
+            <w:r>
+              <w:rPr>
+                <w:lang w:val="en-US"/>
+              </w:rPr>
+              <w:t>crossover_child5_weight</w:t>
+            </w:r>
+          </w:p>
+        </w:tc>
+        <w:tc>
+          <w:tcPr>
+            <w:tcW w:w="0" w:type="auto"/>
+            <w:hideMark/>
+          </w:tcPr>
+          <w:p>
+            <w:pPr>
+              <w:rPr>
+                <w:lang w:val="en-US"/>
+              </w:rPr>
+            </w:pPr>
+            <w:r>
+              <w:rPr>
+                <w:lang w:val="en-US"/>
+              </w:rPr>
+              <w:t>Vjerojatnost odabira petog križara</w:t>
+            </w:r>
+          </w:p>
+        </w:tc>
+        <w:tc>
+          <w:tcPr>
+            <w:tcW w:w="0" w:type="auto"/>
+            <w:hideMark/>
+          </w:tcPr>
+          <w:p>
+            <w:pPr>
+              <w:rPr>
+                <w:lang w:val="en-US"/>
+              </w:rPr>
+            </w:pPr>
+            <m:oMathPara>
+              <m:oMath>
+                <m:r>
+                  <w:rPr>
+                    <w:rFonts w:ascii="Cambria Math" w:hAnsi="Cambria Math"/>
+                  </w:rPr>
+                  <m:t>x∈</m:t>
+                </m:r>
+                <m:d>
+                  <m:dPr>
+                    <m:begChr m:val="["/>
+                    <m:endChr m:val="]"/>
+                    <m:ctrlPr>
+                      <w:rPr>
+                        <w:rFonts w:ascii="Cambria Math" w:hAnsi="Cambria Math"/>
+                        <w:i/>
+                      </w:rPr>
+                    </m:ctrlPr>
+                  </m:dPr>
+                  <m:e>
+                    <m:r>
+                      <w:rPr>
+                        <w:rFonts w:ascii="Cambria Math" w:hAnsi="Cambria Math"/>
+                      </w:rPr>
+                      <m:t>0, 10</m:t>
+                    </m:r>
+                  </m:e>
+                </m:d>
+                <m:r>
+                  <w:rPr>
+                    <w:rFonts w:ascii="Cambria Math" w:hAnsi="Cambria Math"/>
+                  </w:rPr>
+                  <m:t>, x∈</m:t>
+                </m:r>
+                <m:r>
+                  <w:rPr>
+                    <w:rFonts w:ascii="Cambria Math" w:hAnsi="Cambria Math"/>
+                  </w:rPr>
+                  <m:t>R</m:t>
+                </m:r>
+              </m:oMath>
+            </m:oMathPara>
+          </w:p>
+        </w:tc>
+      </w:tr>
+      <w:tr>
+        <w:tc>
+          <w:tcPr>
+            <w:tcW w:w="3910" w:type="dxa"/>
+          </w:tcPr>
+          <w:p/>
+        </w:tc>
+        <w:tc>
+          <w:tcPr>
+            <w:tcW w:w="1946" w:type="dxa"/>
+          </w:tcPr>
+          <w:p/>
+        </w:tc>
+        <w:tc>
+          <w:tcPr>
+            <w:tcW w:w="2922" w:type="dxa"/>
+          </w:tcPr>
+          <w:p/>
+        </w:tc>
+      </w:tr>
+      <w:tr>
+        <w:tc>
+          <w:tcPr>
+            <w:tcW w:w="3910" w:type="dxa"/>
+          </w:tcPr>
+          <w:p/>
+        </w:tc>
+        <w:tc>
+          <w:tcPr>
+            <w:tcW w:w="1946" w:type="dxa"/>
+          </w:tcPr>
+          <w:p/>
+        </w:tc>
+        <w:tc>
+          <w:tcPr>
+            <w:tcW w:w="2922" w:type="dxa"/>
+          </w:tcPr>
+          <w:p/>
+        </w:tc>
+      </w:tr>
+      <w:tr>
+        <w:tc>
+          <w:tcPr>
+            <w:tcW w:w="3910" w:type="dxa"/>
+          </w:tcPr>
+          <w:p/>
+        </w:tc>
+        <w:tc>
+          <w:tcPr>
+            <w:tcW w:w="1946" w:type="dxa"/>
+          </w:tcPr>
+          <w:p/>
+        </w:tc>
+        <w:tc>
+          <w:tcPr>
+            <w:tcW w:w="2922" w:type="dxa"/>
+          </w:tcPr>
+          <w:p/>
+        </w:tc>
+      </w:tr>
+      <w:tr>
+        <w:tc>
+          <w:tcPr>
+            <w:tcW w:w="3910" w:type="dxa"/>
+          </w:tcPr>
+          <w:p/>
+        </w:tc>
+        <w:tc>
+          <w:tcPr>
+            <w:tcW w:w="1946" w:type="dxa"/>
+          </w:tcPr>
+          <w:p/>
+        </w:tc>
+        <w:tc>
+          <w:tcPr>
+            <w:tcW w:w="2922" w:type="dxa"/>
+          </w:tcPr>
+          <w:p/>
+        </w:tc>
+      </w:tr>
+    </w:tbl>
     <w:p/>
     <w:p>
       <w:pPr>
@@ -15901,6 +18562,7 @@
   <w:style w:type="paragraph" w:default="1" w:styleId="Normal">
     <w:name w:val="Normal"/>
     <w:qFormat/>
+    <w:rsid w:val="00D805E3"/>
     <w:pPr>
       <w:spacing w:before="120" w:after="60" w:line="360" w:lineRule="auto"/>
       <w:jc w:val="both"/>
@@ -16099,7 +18761,6 @@
   <w:style w:type="character" w:default="1" w:styleId="DefaultParagraphFont">
     <w:name w:val="Default Paragraph Font"/>
     <w:uiPriority w:val="1"/>
-    <w:semiHidden/>
     <w:unhideWhenUsed/>
   </w:style>
   <w:style w:type="table" w:default="1" w:styleId="TableNormal">
@@ -16737,6 +19398,11 @@
       <w:ind w:left="720"/>
       <w:contextualSpacing/>
     </w:pPr>
+  </w:style>
+  <w:style w:type="character" w:customStyle="1" w:styleId="ng-star-inserted">
+    <w:name w:val="ng-star-inserted"/>
+    <w:basedOn w:val="DefaultParagraphFont"/>
+    <w:rsid w:val="00AE2655"/>
   </w:style>
 </w:styles>
 </file>

</xml_diff>

<commit_message>
(all) bugfixes and extensions and fixes
</commit_message>
<xml_diff>
--- a/docs/Diplomski_rad_predlozak_travanj_2020.docx
+++ b/docs/Diplomski_rad_predlozak_travanj_2020.docx
@@ -11473,6 +11473,41 @@
       </w:r>
       <w:bookmarkEnd w:id="73"/>
     </w:p>
+    <w:p>
+      <w:r>
+        <w:t>Kvaliteta rezultat</w:t>
+      </w:r>
+      <w:r>
+        <w:t xml:space="preserve">a </w:t>
+      </w:r>
+      <w:r>
+        <w:t>algoritma</w:t>
+      </w:r>
+      <w:r>
+        <w:t xml:space="preserve"> uvelike</w:t>
+      </w:r>
+      <w:r>
+        <w:t xml:space="preserve"> ovisi </w:t>
+      </w:r>
+      <w:r>
+        <w:t>o odaberu hiperparametara. S obzirom na dimenziju prostora hiperparametara koja se u našem sastoji od 34 varijable pretraga koja isprobava sve moguće kombinacije (engl. grid search) ne dolazi u obzir. Umjesto grube pretrage, odlučili smo koristiti gotovu implementaciju Bayesovske optimizacije iz knjižnice scikit-optimize. Bayesovska optimizacija industrijski je i akademski standard za optimizaciju hiperparametara. Za razliku od slučajne pretrage, Bayesovska optimizacija koristi prošle evaluacije kod modeliranja probabilističkog modela koji se koristi za predviđanje još neisprobanih kombinacija hiperparametara. Probabilistički model koji se u pozadini koristi jest Gaussov proces koji se pokazao kao vrlo dobar model za skupove podataka s malim brojem uzoraka. Za idući isprobani skup hiperparametara nasumično se koristi jedna od tri akvizicijske metode koje temeljem različitih uvjeta uzorkuju prostor hiperparametara. Očekivano je da algoritam nakon nekog vremena konvergira u neki lokalni optimum sa hiperparametrima koji daju dobre rezultate na testnom skupu trgovina i ograničenja.</w:t>
+      </w:r>
+    </w:p>
+    <w:p>
+      <w:r>
+        <w:t>Radi ravnopravnosti između uzoraka hiperparametara, vrijeme izvođenja pojedinog genetskog algoritma je fiksirano kako prednost, zbog svoje robustnosti, ne bi imali skupovi hiperparametara koji koriste veće populacije odnosno izvršavaju se u više iteracija. S obzirom na to da koristimo više vrsti genetskih operatora za svaki genetski operator prostor hiperparametara modelirati ćemo na način da svaku podvrstu genetskog operatora stavimo u jedan kompozitni operator u nadi da će težine kompozitnog operatora konvergirati prema onome najboljem, odnosno najboljoj distribuciji za odabir konkretnog operatora. Ovu logiku primjenjujemo na operatore mutacije i križanja, dok isto nema smisla raditi za operatore selekcije i eliminacije pa ćemo kod tih operatora „žrtvovati“ nekoliko hiperparametara koji, ovisno o konkretnom skupu hiperparametara neće utjecati na optimizacijski postupak.</w:t>
+      </w:r>
+    </w:p>
+    <w:p>
+      <w:r>
+        <w:t>Radi dobrog pokrivanja prostora problema, za evaluaciju koristiti ćemo nekoliko instanci skupova podataka tako da bi rezultantni skup hiperparametara trebao dobro funkcionirati na različitim skupovima trgovina.</w:t>
+      </w:r>
+    </w:p>
+    <w:p>
+      <w:r>
+        <w:t>Rezultate uzoraka hiperparametara zajedno sa njihovim konačnim, najboljim, vrijednostima funkcije dobrote spremati ćemo te na kraju napraviti analizu pojedinih hiperparametara koji bi najviše mogli utjecati na kvalitetu rezultata algoritma.</w:t>
+      </w:r>
+    </w:p>
     <w:p/>
     <w:tbl>
       <w:tblPr>
@@ -11481,14 +11516,14 @@
         <w:tblLook w:val="04A0" w:firstRow="1" w:lastRow="0" w:firstColumn="1" w:lastColumn="0" w:noHBand="0" w:noVBand="1"/>
       </w:tblPr>
       <w:tblGrid>
-        <w:gridCol w:w="3910"/>
-        <w:gridCol w:w="1946"/>
+        <w:gridCol w:w="2096"/>
+        <w:gridCol w:w="3760"/>
         <w:gridCol w:w="2922"/>
       </w:tblGrid>
       <w:tr>
         <w:tc>
           <w:tcPr>
-            <w:tcW w:w="3910" w:type="dxa"/>
+            <w:tcW w:w="2065" w:type="dxa"/>
           </w:tcPr>
           <w:p>
             <w:r>
@@ -11498,7 +11533,7 @@
         </w:tc>
         <w:tc>
           <w:tcPr>
-            <w:tcW w:w="1946" w:type="dxa"/>
+            <w:tcW w:w="3791" w:type="dxa"/>
           </w:tcPr>
           <w:p>
             <w:r>
@@ -11520,17 +11555,23 @@
       <w:tr>
         <w:tc>
           <w:tcPr>
-            <w:tcW w:w="3910" w:type="dxa"/>
+            <w:tcW w:w="2065" w:type="dxa"/>
           </w:tcPr>
           <w:p>
             <w:r>
-              <w:t>MAX_CLUSTER_DISTANCE</w:t>
+              <w:t>MAX_CLUSTER_</w:t>
+            </w:r>
+            <w:r>
+              <w:t xml:space="preserve"> </w:t>
+            </w:r>
+            <w:r>
+              <w:t>DISTANCE</w:t>
             </w:r>
           </w:p>
         </w:tc>
         <w:tc>
           <w:tcPr>
-            <w:tcW w:w="1946" w:type="dxa"/>
+            <w:tcW w:w="3791" w:type="dxa"/>
           </w:tcPr>
           <w:p>
             <w:r>
@@ -11588,17 +11629,23 @@
       <w:tr>
         <w:tc>
           <w:tcPr>
-            <w:tcW w:w="3910" w:type="dxa"/>
+            <w:tcW w:w="2065" w:type="dxa"/>
           </w:tcPr>
           <w:p>
             <w:r>
-              <w:t>MAX_CLUSTER_JOIN_DISTANCE</w:t>
+              <w:t>MAX_CLUSTER_</w:t>
+            </w:r>
+            <w:r>
+              <w:t xml:space="preserve"> </w:t>
+            </w:r>
+            <w:r>
+              <w:t>JOIN_DISTANCE</w:t>
             </w:r>
           </w:p>
         </w:tc>
         <w:tc>
           <w:tcPr>
-            <w:tcW w:w="1946" w:type="dxa"/>
+            <w:tcW w:w="3791" w:type="dxa"/>
           </w:tcPr>
           <w:p>
             <w:r>
@@ -11656,7 +11703,7 @@
       <w:tr>
         <w:tc>
           <w:tcPr>
-            <w:tcW w:w="3910" w:type="dxa"/>
+            <w:tcW w:w="2065" w:type="dxa"/>
           </w:tcPr>
           <w:p>
             <w:r>
@@ -11666,7 +11713,7 @@
         </w:tc>
         <w:tc>
           <w:tcPr>
-            <w:tcW w:w="1946" w:type="dxa"/>
+            <w:tcW w:w="3791" w:type="dxa"/>
           </w:tcPr>
           <w:p>
             <w:r>
@@ -11719,7 +11766,7 @@
       <w:tr>
         <w:tc>
           <w:tcPr>
-            <w:tcW w:w="3910" w:type="dxa"/>
+            <w:tcW w:w="2065" w:type="dxa"/>
           </w:tcPr>
           <w:p>
             <w:r>
@@ -11729,7 +11776,7 @@
         </w:tc>
         <w:tc>
           <w:tcPr>
-            <w:tcW w:w="1946" w:type="dxa"/>
+            <w:tcW w:w="3791" w:type="dxa"/>
           </w:tcPr>
           <w:p>
             <w:r>
@@ -11818,7 +11865,7 @@
       <w:tr>
         <w:tc>
           <w:tcPr>
-            <w:tcW w:w="3910" w:type="dxa"/>
+            <w:tcW w:w="2065" w:type="dxa"/>
           </w:tcPr>
           <w:p>
             <w:r>
@@ -11828,7 +11875,7 @@
         </w:tc>
         <w:tc>
           <w:tcPr>
-            <w:tcW w:w="1946" w:type="dxa"/>
+            <w:tcW w:w="3791" w:type="dxa"/>
           </w:tcPr>
           <w:p>
             <w:r>
@@ -11850,17 +11897,23 @@
       <w:tr>
         <w:tc>
           <w:tcPr>
-            <w:tcW w:w="3910" w:type="dxa"/>
+            <w:tcW w:w="2065" w:type="dxa"/>
           </w:tcPr>
           <w:p>
             <w:r>
-              <w:t>Selection_tournamentSize</w:t>
+              <w:t>Selection_</w:t>
+            </w:r>
+            <w:r>
+              <w:t xml:space="preserve"> </w:t>
+            </w:r>
+            <w:r>
+              <w:t>tournamentSize</w:t>
             </w:r>
           </w:p>
         </w:tc>
         <w:tc>
           <w:tcPr>
-            <w:tcW w:w="1946" w:type="dxa"/>
+            <w:tcW w:w="3791" w:type="dxa"/>
           </w:tcPr>
           <w:p>
             <w:r>
@@ -11921,18 +11974,17 @@
       <w:tr>
         <w:tc>
           <w:tcPr>
-            <w:tcW w:w="3910" w:type="dxa"/>
+            <w:tcW w:w="2065" w:type="dxa"/>
           </w:tcPr>
           <w:p>
             <w:r>
-              <w:lastRenderedPageBreak/>
               <w:t xml:space="preserve"> Elimination type</w:t>
             </w:r>
           </w:p>
         </w:tc>
         <w:tc>
           <w:tcPr>
-            <w:tcW w:w="1946" w:type="dxa"/>
+            <w:tcW w:w="3791" w:type="dxa"/>
           </w:tcPr>
           <w:p>
             <w:r>
@@ -11954,17 +12006,23 @@
       <w:tr>
         <w:tc>
           <w:tcPr>
-            <w:tcW w:w="3910" w:type="dxa"/>
+            <w:tcW w:w="2065" w:type="dxa"/>
           </w:tcPr>
           <w:p>
             <w:r>
-              <w:t>Eliminator_elitism</w:t>
+              <w:t>Eliminator_</w:t>
+            </w:r>
+            <w:r>
+              <w:t xml:space="preserve"> </w:t>
+            </w:r>
+            <w:r>
+              <w:t>elitism</w:t>
             </w:r>
           </w:p>
         </w:tc>
         <w:tc>
           <w:tcPr>
-            <w:tcW w:w="1946" w:type="dxa"/>
+            <w:tcW w:w="3791" w:type="dxa"/>
           </w:tcPr>
           <w:p>
             <w:r>
@@ -12037,17 +12095,23 @@
       <w:tr>
         <w:tc>
           <w:tcPr>
-            <w:tcW w:w="3910" w:type="dxa"/>
+            <w:tcW w:w="2065" w:type="dxa"/>
           </w:tcPr>
           <w:p>
             <w:r>
-              <w:t>Eliminator_survivalRate</w:t>
+              <w:t>Eliminator_</w:t>
+            </w:r>
+            <w:r>
+              <w:t xml:space="preserve"> </w:t>
+            </w:r>
+            <w:r>
+              <w:t>survivalRate</w:t>
             </w:r>
           </w:p>
         </w:tc>
         <w:tc>
           <w:tcPr>
-            <w:tcW w:w="1946" w:type="dxa"/>
+            <w:tcW w:w="3791" w:type="dxa"/>
           </w:tcPr>
           <w:p>
             <w:r>
@@ -12120,7 +12184,7 @@
       <w:tr>
         <w:tc>
           <w:tcPr>
-            <w:tcW w:w="3910" w:type="dxa"/>
+            <w:tcW w:w="2065" w:type="dxa"/>
           </w:tcPr>
           <w:p>
             <w:r>
@@ -12130,7 +12194,7 @@
         </w:tc>
         <w:tc>
           <w:tcPr>
-            <w:tcW w:w="1946" w:type="dxa"/>
+            <w:tcW w:w="3791" w:type="dxa"/>
           </w:tcPr>
           <w:p>
             <w:r>
@@ -12214,17 +12278,23 @@
       <w:tr>
         <w:tc>
           <w:tcPr>
-            <w:tcW w:w="3910" w:type="dxa"/>
+            <w:tcW w:w="2065" w:type="dxa"/>
           </w:tcPr>
           <w:p>
             <w:r>
-              <w:t>Mutator_child1_numMutations</w:t>
+              <w:t>Mutator_child1_</w:t>
+            </w:r>
+            <w:r>
+              <w:t xml:space="preserve"> </w:t>
+            </w:r>
+            <w:r>
+              <w:t>numMutations</w:t>
             </w:r>
           </w:p>
         </w:tc>
         <w:tc>
           <w:tcPr>
-            <w:tcW w:w="1946" w:type="dxa"/>
+            <w:tcW w:w="3791" w:type="dxa"/>
           </w:tcPr>
           <w:p>
             <w:r>
@@ -12300,23 +12370,30 @@
       <w:tr>
         <w:tc>
           <w:tcPr>
-            <w:tcW w:w="3910" w:type="dxa"/>
+            <w:tcW w:w="2065" w:type="dxa"/>
           </w:tcPr>
           <w:p>
             <w:r>
+              <w:lastRenderedPageBreak/>
               <w:t>Mutator_child</w:t>
             </w:r>
             <w:r>
               <w:t>2</w:t>
             </w:r>
             <w:r>
-              <w:t>_numMutations</w:t>
+              <w:t>_</w:t>
+            </w:r>
+            <w:r>
+              <w:t xml:space="preserve"> </w:t>
+            </w:r>
+            <w:r>
+              <w:t>numMutations</w:t>
             </w:r>
           </w:p>
         </w:tc>
         <w:tc>
           <w:tcPr>
-            <w:tcW w:w="1946" w:type="dxa"/>
+            <w:tcW w:w="3791" w:type="dxa"/>
           </w:tcPr>
           <w:p>
             <w:r>
@@ -12389,7 +12466,7 @@
       <w:tr>
         <w:tc>
           <w:tcPr>
-            <w:tcW w:w="3910" w:type="dxa"/>
+            <w:tcW w:w="2065" w:type="dxa"/>
           </w:tcPr>
           <w:p>
             <w:r>
@@ -12402,7 +12479,7 @@
         </w:tc>
         <w:tc>
           <w:tcPr>
-            <w:tcW w:w="1946" w:type="dxa"/>
+            <w:tcW w:w="3791" w:type="dxa"/>
           </w:tcPr>
           <w:p>
             <w:r>
@@ -12475,7 +12552,7 @@
       <w:tr>
         <w:tc>
           <w:tcPr>
-            <w:tcW w:w="3910" w:type="dxa"/>
+            <w:tcW w:w="2065" w:type="dxa"/>
           </w:tcPr>
           <w:p>
             <w:r>
@@ -12491,7 +12568,7 @@
         </w:tc>
         <w:tc>
           <w:tcPr>
-            <w:tcW w:w="1946" w:type="dxa"/>
+            <w:tcW w:w="3791" w:type="dxa"/>
           </w:tcPr>
           <w:p>
             <w:r>
@@ -12558,18 +12635,23 @@
       <w:tr>
         <w:tc>
           <w:tcPr>
-            <w:tcW w:w="3910" w:type="dxa"/>
+            <w:tcW w:w="2065" w:type="dxa"/>
           </w:tcPr>
           <w:p>
             <w:r>
-              <w:lastRenderedPageBreak/>
-              <w:t>Mutator_child1_weight</w:t>
+              <w:t>Mutator_child1_</w:t>
+            </w:r>
+            <w:r>
+              <w:t xml:space="preserve"> </w:t>
+            </w:r>
+            <w:r>
+              <w:t>weight</w:t>
             </w:r>
           </w:p>
         </w:tc>
         <w:tc>
           <w:tcPr>
-            <w:tcW w:w="1946" w:type="dxa"/>
+            <w:tcW w:w="3791" w:type="dxa"/>
           </w:tcPr>
           <w:p>
             <w:r>
@@ -12636,7 +12718,7 @@
       <w:tr>
         <w:tc>
           <w:tcPr>
-            <w:tcW w:w="3910" w:type="dxa"/>
+            <w:tcW w:w="2065" w:type="dxa"/>
           </w:tcPr>
           <w:p>
             <w:r>
@@ -12646,13 +12728,19 @@
               <w:t>2</w:t>
             </w:r>
             <w:r>
-              <w:t>_weight</w:t>
+              <w:t>_</w:t>
+            </w:r>
+            <w:r>
+              <w:t xml:space="preserve"> </w:t>
+            </w:r>
+            <w:r>
+              <w:t>weight</w:t>
             </w:r>
           </w:p>
         </w:tc>
         <w:tc>
           <w:tcPr>
-            <w:tcW w:w="1946" w:type="dxa"/>
+            <w:tcW w:w="3791" w:type="dxa"/>
           </w:tcPr>
           <w:p>
             <w:r>
@@ -12719,7 +12807,7 @@
       <w:tr>
         <w:tc>
           <w:tcPr>
-            <w:tcW w:w="0" w:type="auto"/>
+            <w:tcW w:w="2065" w:type="dxa"/>
             <w:hideMark/>
           </w:tcPr>
           <w:p>
@@ -12732,13 +12820,25 @@
               <w:rPr>
                 <w:lang w:val="en-US"/>
               </w:rPr>
-              <w:t>crossover_child1_geoP</w:t>
+              <w:t>crossover_child1_</w:t>
+            </w:r>
+            <w:r>
+              <w:rPr>
+                <w:lang w:val="en-US"/>
+              </w:rPr>
+              <w:t xml:space="preserve"> </w:t>
+            </w:r>
+            <w:r>
+              <w:rPr>
+                <w:lang w:val="en-US"/>
+              </w:rPr>
+              <w:t>geoP</w:t>
             </w:r>
           </w:p>
         </w:tc>
         <w:tc>
           <w:tcPr>
-            <w:tcW w:w="0" w:type="auto"/>
+            <w:tcW w:w="3791" w:type="dxa"/>
             <w:hideMark/>
           </w:tcPr>
           <w:p>
@@ -12820,7 +12920,7 @@
       <w:tr>
         <w:tc>
           <w:tcPr>
-            <w:tcW w:w="0" w:type="auto"/>
+            <w:tcW w:w="2065" w:type="dxa"/>
             <w:hideMark/>
           </w:tcPr>
           <w:p>
@@ -12833,13 +12933,25 @@
               <w:rPr>
                 <w:lang w:val="en-US"/>
               </w:rPr>
-              <w:t>crossover_child1_crossoverProb</w:t>
+              <w:t>crossover_child1_</w:t>
+            </w:r>
+            <w:r>
+              <w:rPr>
+                <w:lang w:val="en-US"/>
+              </w:rPr>
+              <w:t xml:space="preserve"> </w:t>
+            </w:r>
+            <w:r>
+              <w:rPr>
+                <w:lang w:val="en-US"/>
+              </w:rPr>
+              <w:t>crossoverProb</w:t>
             </w:r>
           </w:p>
         </w:tc>
         <w:tc>
           <w:tcPr>
-            <w:tcW w:w="0" w:type="auto"/>
+            <w:tcW w:w="3791" w:type="dxa"/>
             <w:hideMark/>
           </w:tcPr>
           <w:p>
@@ -12852,7 +12964,13 @@
               <w:rPr>
                 <w:lang w:val="en-US"/>
               </w:rPr>
-              <w:t>Vjerojatnost križanja prvog križara</w:t>
+              <w:t xml:space="preserve">Vjerojatnost križanja </w:t>
+            </w:r>
+            <w:r>
+              <w:rPr>
+                <w:lang w:val="en-US"/>
+              </w:rPr>
+              <w:t>prvog križanja</w:t>
             </w:r>
           </w:p>
         </w:tc>
@@ -12891,7 +13009,25 @@
                       <w:rPr>
                         <w:rFonts w:ascii="Cambria Math" w:hAnsi="Cambria Math"/>
                       </w:rPr>
-                      <m:t>0, 10</m:t>
+                      <m:t>0</m:t>
+                    </m:r>
+                    <m:r>
+                      <w:rPr>
+                        <w:rFonts w:ascii="Cambria Math" w:hAnsi="Cambria Math"/>
+                      </w:rPr>
+                      <m:t>1</m:t>
+                    </m:r>
+                    <m:r>
+                      <w:rPr>
+                        <w:rFonts w:ascii="Cambria Math" w:hAnsi="Cambria Math"/>
+                      </w:rPr>
+                      <m:t xml:space="preserve">, </m:t>
+                    </m:r>
+                    <m:r>
+                      <w:rPr>
+                        <w:rFonts w:ascii="Cambria Math" w:hAnsi="Cambria Math"/>
+                      </w:rPr>
+                      <m:t>0.95</m:t>
                     </m:r>
                   </m:e>
                 </m:d>
@@ -12915,7 +13051,7 @@
       <w:tr>
         <w:tc>
           <w:tcPr>
-            <w:tcW w:w="0" w:type="auto"/>
+            <w:tcW w:w="2065" w:type="dxa"/>
             <w:hideMark/>
           </w:tcPr>
           <w:p>
@@ -12928,13 +13064,25 @@
               <w:rPr>
                 <w:lang w:val="en-US"/>
               </w:rPr>
-              <w:t>crossover_child1_weight</w:t>
+              <w:t>crossover_child1_</w:t>
+            </w:r>
+            <w:r>
+              <w:rPr>
+                <w:lang w:val="en-US"/>
+              </w:rPr>
+              <w:t xml:space="preserve"> </w:t>
+            </w:r>
+            <w:r>
+              <w:rPr>
+                <w:lang w:val="en-US"/>
+              </w:rPr>
+              <w:t>weight</w:t>
             </w:r>
           </w:p>
         </w:tc>
         <w:tc>
           <w:tcPr>
-            <w:tcW w:w="0" w:type="auto"/>
+            <w:tcW w:w="3791" w:type="dxa"/>
             <w:hideMark/>
           </w:tcPr>
           <w:p>
@@ -12947,7 +13095,13 @@
               <w:rPr>
                 <w:lang w:val="en-US"/>
               </w:rPr>
-              <w:t>Vjerojatnost odabira prvog križara</w:t>
+              <w:t xml:space="preserve">Vjerojatnost odabira prvog </w:t>
+            </w:r>
+            <w:r>
+              <w:rPr>
+                <w:lang w:val="en-US"/>
+              </w:rPr>
+              <w:t>križanja</w:t>
             </w:r>
           </w:p>
         </w:tc>
@@ -12986,7 +13140,25 @@
                       <w:rPr>
                         <w:rFonts w:ascii="Cambria Math" w:hAnsi="Cambria Math"/>
                       </w:rPr>
-                      <m:t>0, 10</m:t>
+                      <m:t>0</m:t>
+                    </m:r>
+                    <m:r>
+                      <w:rPr>
+                        <w:rFonts w:ascii="Cambria Math" w:hAnsi="Cambria Math"/>
+                      </w:rPr>
+                      <m:t>.1</m:t>
+                    </m:r>
+                    <m:r>
+                      <w:rPr>
+                        <w:rFonts w:ascii="Cambria Math" w:hAnsi="Cambria Math"/>
+                      </w:rPr>
+                      <m:t xml:space="preserve">, </m:t>
+                    </m:r>
+                    <m:r>
+                      <w:rPr>
+                        <w:rFonts w:ascii="Cambria Math" w:hAnsi="Cambria Math"/>
+                      </w:rPr>
+                      <m:t>1</m:t>
                     </m:r>
                   </m:e>
                 </m:d>
@@ -13010,7 +13182,7 @@
       <w:tr>
         <w:tc>
           <w:tcPr>
-            <w:tcW w:w="0" w:type="auto"/>
+            <w:tcW w:w="2065" w:type="dxa"/>
             <w:hideMark/>
           </w:tcPr>
           <w:p>
@@ -13023,13 +13195,25 @@
               <w:rPr>
                 <w:lang w:val="en-US"/>
               </w:rPr>
-              <w:t>crossover_child2_geoP</w:t>
+              <w:t>crossover_child2_</w:t>
+            </w:r>
+            <w:r>
+              <w:rPr>
+                <w:lang w:val="en-US"/>
+              </w:rPr>
+              <w:t xml:space="preserve"> </w:t>
+            </w:r>
+            <w:r>
+              <w:rPr>
+                <w:lang w:val="en-US"/>
+              </w:rPr>
+              <w:t>geoP</w:t>
             </w:r>
           </w:p>
         </w:tc>
         <w:tc>
           <w:tcPr>
-            <w:tcW w:w="0" w:type="auto"/>
+            <w:tcW w:w="3791" w:type="dxa"/>
             <w:hideMark/>
           </w:tcPr>
           <w:p>
@@ -13042,7 +13226,13 @@
               <w:rPr>
                 <w:lang w:val="en-US"/>
               </w:rPr>
-              <w:t>Parametar geoP drugog križara</w:t>
+              <w:t xml:space="preserve">Parametar </w:t>
+            </w:r>
+            <w:r>
+              <w:rPr>
+                <w:lang w:val="en-US"/>
+              </w:rPr>
+              <w:t>geometrijske distribucije geometrijskog križanja po retcima</w:t>
             </w:r>
           </w:p>
         </w:tc>
@@ -13081,7 +13271,7 @@
                       <w:rPr>
                         <w:rFonts w:ascii="Cambria Math" w:hAnsi="Cambria Math"/>
                       </w:rPr>
-                      <m:t>0, 10</m:t>
+                      <m:t>01, 0.95</m:t>
                     </m:r>
                   </m:e>
                 </m:d>
@@ -13105,7 +13295,7 @@
       <w:tr>
         <w:tc>
           <w:tcPr>
-            <w:tcW w:w="0" w:type="auto"/>
+            <w:tcW w:w="2065" w:type="dxa"/>
             <w:hideMark/>
           </w:tcPr>
           <w:p>
@@ -13118,13 +13308,25 @@
               <w:rPr>
                 <w:lang w:val="en-US"/>
               </w:rPr>
-              <w:t>crossover_child2_crossoverProb</w:t>
+              <w:t>crossover_child2_</w:t>
+            </w:r>
+            <w:r>
+              <w:rPr>
+                <w:lang w:val="en-US"/>
+              </w:rPr>
+              <w:t xml:space="preserve"> </w:t>
+            </w:r>
+            <w:r>
+              <w:rPr>
+                <w:lang w:val="en-US"/>
+              </w:rPr>
+              <w:t>crossoverProb</w:t>
             </w:r>
           </w:p>
         </w:tc>
         <w:tc>
           <w:tcPr>
-            <w:tcW w:w="0" w:type="auto"/>
+            <w:tcW w:w="3791" w:type="dxa"/>
             <w:hideMark/>
           </w:tcPr>
           <w:p>
@@ -13137,7 +13339,13 @@
               <w:rPr>
                 <w:lang w:val="en-US"/>
               </w:rPr>
-              <w:t>Vjerojatnost križanja drugog križara</w:t>
+              <w:t xml:space="preserve">Vjerojatnost križanja drugog </w:t>
+            </w:r>
+            <w:r>
+              <w:rPr>
+                <w:lang w:val="en-US"/>
+              </w:rPr>
+              <w:t>križanja</w:t>
             </w:r>
           </w:p>
         </w:tc>
@@ -13176,7 +13384,7 @@
                       <w:rPr>
                         <w:rFonts w:ascii="Cambria Math" w:hAnsi="Cambria Math"/>
                       </w:rPr>
-                      <m:t>0, 10</m:t>
+                      <m:t>01, 0.95</m:t>
                     </m:r>
                   </m:e>
                 </m:d>
@@ -13200,7 +13408,7 @@
       <w:tr>
         <w:tc>
           <w:tcPr>
-            <w:tcW w:w="0" w:type="auto"/>
+            <w:tcW w:w="2065" w:type="dxa"/>
             <w:hideMark/>
           </w:tcPr>
           <w:p>
@@ -13213,13 +13421,25 @@
               <w:rPr>
                 <w:lang w:val="en-US"/>
               </w:rPr>
-              <w:t>crossover_child2_weight</w:t>
+              <w:t>crossover_child2_</w:t>
+            </w:r>
+            <w:r>
+              <w:rPr>
+                <w:lang w:val="en-US"/>
+              </w:rPr>
+              <w:t xml:space="preserve"> </w:t>
+            </w:r>
+            <w:r>
+              <w:rPr>
+                <w:lang w:val="en-US"/>
+              </w:rPr>
+              <w:t>weight</w:t>
             </w:r>
           </w:p>
         </w:tc>
         <w:tc>
           <w:tcPr>
-            <w:tcW w:w="0" w:type="auto"/>
+            <w:tcW w:w="3791" w:type="dxa"/>
             <w:hideMark/>
           </w:tcPr>
           <w:p>
@@ -13232,7 +13452,13 @@
               <w:rPr>
                 <w:lang w:val="en-US"/>
               </w:rPr>
-              <w:t>Vjerojatnost odabira drugog križara</w:t>
+              <w:t xml:space="preserve">Vjerojatnost odabira drugog </w:t>
+            </w:r>
+            <w:r>
+              <w:rPr>
+                <w:lang w:val="en-US"/>
+              </w:rPr>
+              <w:t>križanja</w:t>
             </w:r>
           </w:p>
         </w:tc>
@@ -13271,7 +13497,7 @@
                       <w:rPr>
                         <w:rFonts w:ascii="Cambria Math" w:hAnsi="Cambria Math"/>
                       </w:rPr>
-                      <m:t>0, 10</m:t>
+                      <m:t>0.1, 1</m:t>
                     </m:r>
                   </m:e>
                 </m:d>
@@ -13295,7 +13521,7 @@
       <w:tr>
         <w:tc>
           <w:tcPr>
-            <w:tcW w:w="0" w:type="auto"/>
+            <w:tcW w:w="2065" w:type="dxa"/>
             <w:hideMark/>
           </w:tcPr>
           <w:p>
@@ -13314,7 +13540,7 @@
         </w:tc>
         <w:tc>
           <w:tcPr>
-            <w:tcW w:w="0" w:type="auto"/>
+            <w:tcW w:w="3791" w:type="dxa"/>
             <w:hideMark/>
           </w:tcPr>
           <w:p>
@@ -13327,7 +13553,7 @@
               <w:rPr>
                 <w:lang w:val="en-US"/>
               </w:rPr>
-              <w:t>Parametar p trećeg križara</w:t>
+              <w:t>Vjerojatnost križanja operatora križanja s jednom točkom prekida</w:t>
             </w:r>
           </w:p>
         </w:tc>
@@ -13366,7 +13592,25 @@
                       <w:rPr>
                         <w:rFonts w:ascii="Cambria Math" w:hAnsi="Cambria Math"/>
                       </w:rPr>
-                      <m:t>0, 10</m:t>
+                      <m:t>0</m:t>
+                    </m:r>
+                    <m:r>
+                      <w:rPr>
+                        <w:rFonts w:ascii="Cambria Math" w:hAnsi="Cambria Math"/>
+                      </w:rPr>
+                      <m:t>.1</m:t>
+                    </m:r>
+                    <m:r>
+                      <w:rPr>
+                        <w:rFonts w:ascii="Cambria Math" w:hAnsi="Cambria Math"/>
+                      </w:rPr>
+                      <m:t xml:space="preserve">, </m:t>
+                    </m:r>
+                    <m:r>
+                      <w:rPr>
+                        <w:rFonts w:ascii="Cambria Math" w:hAnsi="Cambria Math"/>
+                      </w:rPr>
+                      <m:t>0.9</m:t>
                     </m:r>
                   </m:e>
                 </m:d>
@@ -13390,7 +13634,7 @@
       <w:tr>
         <w:tc>
           <w:tcPr>
-            <w:tcW w:w="0" w:type="auto"/>
+            <w:tcW w:w="2065" w:type="dxa"/>
             <w:hideMark/>
           </w:tcPr>
           <w:p>
@@ -13403,14 +13647,25 @@
               <w:rPr>
                 <w:lang w:val="en-US"/>
               </w:rPr>
-              <w:lastRenderedPageBreak/>
-              <w:t>crossover_child3_weight</w:t>
+              <w:t>crossover_child3_</w:t>
+            </w:r>
+            <w:r>
+              <w:rPr>
+                <w:lang w:val="en-US"/>
+              </w:rPr>
+              <w:t xml:space="preserve"> </w:t>
+            </w:r>
+            <w:r>
+              <w:rPr>
+                <w:lang w:val="en-US"/>
+              </w:rPr>
+              <w:t>weight</w:t>
             </w:r>
           </w:p>
         </w:tc>
         <w:tc>
           <w:tcPr>
-            <w:tcW w:w="0" w:type="auto"/>
+            <w:tcW w:w="3791" w:type="dxa"/>
             <w:hideMark/>
           </w:tcPr>
           <w:p>
@@ -13423,7 +13678,13 @@
               <w:rPr>
                 <w:lang w:val="en-US"/>
               </w:rPr>
-              <w:t>Vjerojatnost odabira trećeg križara</w:t>
+              <w:t xml:space="preserve">Vjerojatnost odabira trećeg </w:t>
+            </w:r>
+            <w:r>
+              <w:rPr>
+                <w:lang w:val="en-US"/>
+              </w:rPr>
+              <w:t>križanja</w:t>
             </w:r>
           </w:p>
         </w:tc>
@@ -13462,7 +13723,7 @@
                       <w:rPr>
                         <w:rFonts w:ascii="Cambria Math" w:hAnsi="Cambria Math"/>
                       </w:rPr>
-                      <m:t>0, 10</m:t>
+                      <m:t>0.1, 1</m:t>
                     </m:r>
                   </m:e>
                 </m:d>
@@ -13486,7 +13747,7 @@
       <w:tr>
         <w:tc>
           <w:tcPr>
-            <w:tcW w:w="0" w:type="auto"/>
+            <w:tcW w:w="2065" w:type="dxa"/>
             <w:hideMark/>
           </w:tcPr>
           <w:p>
@@ -13499,13 +13760,14 @@
               <w:rPr>
                 <w:lang w:val="en-US"/>
               </w:rPr>
+              <w:lastRenderedPageBreak/>
               <w:t>crossover_child4_k</w:t>
             </w:r>
           </w:p>
         </w:tc>
         <w:tc>
           <w:tcPr>
-            <w:tcW w:w="0" w:type="auto"/>
+            <w:tcW w:w="3791" w:type="dxa"/>
             <w:hideMark/>
           </w:tcPr>
           <w:p>
@@ -13518,7 +13780,13 @@
               <w:rPr>
                 <w:lang w:val="en-US"/>
               </w:rPr>
-              <w:t>Parametar k četvrtog križara</w:t>
+              <w:t>Parametar</w:t>
+            </w:r>
+            <w:r>
+              <w:rPr>
+                <w:lang w:val="en-US"/>
+              </w:rPr>
+              <w:t xml:space="preserve"> k operatora križanja s K izmjena redaka</w:t>
             </w:r>
           </w:p>
         </w:tc>
@@ -13557,7 +13825,19 @@
                       <w:rPr>
                         <w:rFonts w:ascii="Cambria Math" w:hAnsi="Cambria Math"/>
                       </w:rPr>
-                      <m:t>0, 10</m:t>
+                      <m:t>2</m:t>
+                    </m:r>
+                    <m:r>
+                      <w:rPr>
+                        <w:rFonts w:ascii="Cambria Math" w:hAnsi="Cambria Math"/>
+                      </w:rPr>
+                      <m:t xml:space="preserve">, </m:t>
+                    </m:r>
+                    <m:r>
+                      <w:rPr>
+                        <w:rFonts w:ascii="Cambria Math" w:hAnsi="Cambria Math"/>
+                      </w:rPr>
+                      <m:t>8</m:t>
                     </m:r>
                   </m:e>
                 </m:d>
@@ -13571,7 +13851,7 @@
                   <w:rPr>
                     <w:rFonts w:ascii="Cambria Math" w:hAnsi="Cambria Math"/>
                   </w:rPr>
-                  <m:t>R</m:t>
+                  <m:t>N</m:t>
                 </m:r>
               </m:oMath>
             </m:oMathPara>
@@ -13581,7 +13861,7 @@
       <w:tr>
         <w:tc>
           <w:tcPr>
-            <w:tcW w:w="0" w:type="auto"/>
+            <w:tcW w:w="2065" w:type="dxa"/>
             <w:hideMark/>
           </w:tcPr>
           <w:p>
@@ -13600,7 +13880,7 @@
         </w:tc>
         <w:tc>
           <w:tcPr>
-            <w:tcW w:w="0" w:type="auto"/>
+            <w:tcW w:w="3791" w:type="dxa"/>
             <w:hideMark/>
           </w:tcPr>
           <w:p>
@@ -13613,7 +13893,7 @@
               <w:rPr>
                 <w:lang w:val="en-US"/>
               </w:rPr>
-              <w:t>Parametar p četvrtog križara</w:t>
+              <w:t>Vjerojatnost četvrtog križanja</w:t>
             </w:r>
           </w:p>
         </w:tc>
@@ -13652,7 +13932,25 @@
                       <w:rPr>
                         <w:rFonts w:ascii="Cambria Math" w:hAnsi="Cambria Math"/>
                       </w:rPr>
-                      <m:t>0, 10</m:t>
+                      <m:t>0</m:t>
+                    </m:r>
+                    <m:r>
+                      <w:rPr>
+                        <w:rFonts w:ascii="Cambria Math" w:hAnsi="Cambria Math"/>
+                      </w:rPr>
+                      <m:t>.1</m:t>
+                    </m:r>
+                    <m:r>
+                      <w:rPr>
+                        <w:rFonts w:ascii="Cambria Math" w:hAnsi="Cambria Math"/>
+                      </w:rPr>
+                      <m:t xml:space="preserve">, </m:t>
+                    </m:r>
+                    <m:r>
+                      <w:rPr>
+                        <w:rFonts w:ascii="Cambria Math" w:hAnsi="Cambria Math"/>
+                      </w:rPr>
+                      <m:t>0.95</m:t>
                     </m:r>
                   </m:e>
                 </m:d>
@@ -13676,7 +13974,7 @@
       <w:tr>
         <w:tc>
           <w:tcPr>
-            <w:tcW w:w="0" w:type="auto"/>
+            <w:tcW w:w="2065" w:type="dxa"/>
             <w:hideMark/>
           </w:tcPr>
           <w:p>
@@ -13689,13 +13987,25 @@
               <w:rPr>
                 <w:lang w:val="en-US"/>
               </w:rPr>
-              <w:t>crossover_child4_weight</w:t>
+              <w:t>crossover_child4_</w:t>
+            </w:r>
+            <w:r>
+              <w:rPr>
+                <w:lang w:val="en-US"/>
+              </w:rPr>
+              <w:t xml:space="preserve"> </w:t>
+            </w:r>
+            <w:r>
+              <w:rPr>
+                <w:lang w:val="en-US"/>
+              </w:rPr>
+              <w:t>weight</w:t>
             </w:r>
           </w:p>
         </w:tc>
         <w:tc>
           <w:tcPr>
-            <w:tcW w:w="0" w:type="auto"/>
+            <w:tcW w:w="3791" w:type="dxa"/>
             <w:hideMark/>
           </w:tcPr>
           <w:p>
@@ -13708,7 +14018,13 @@
               <w:rPr>
                 <w:lang w:val="en-US"/>
               </w:rPr>
-              <w:t>Vjerojatnost odabira četvrtog križara</w:t>
+              <w:t xml:space="preserve">Vjerojatnost odabira četvrtog </w:t>
+            </w:r>
+            <w:r>
+              <w:rPr>
+                <w:lang w:val="en-US"/>
+              </w:rPr>
+              <w:t>križanja</w:t>
             </w:r>
           </w:p>
         </w:tc>
@@ -13747,7 +14063,7 @@
                       <w:rPr>
                         <w:rFonts w:ascii="Cambria Math" w:hAnsi="Cambria Math"/>
                       </w:rPr>
-                      <m:t>0, 10</m:t>
+                      <m:t>0.1, 1</m:t>
                     </m:r>
                   </m:e>
                 </m:d>
@@ -13771,7 +14087,7 @@
       <w:tr>
         <w:tc>
           <w:tcPr>
-            <w:tcW w:w="0" w:type="auto"/>
+            <w:tcW w:w="2065" w:type="dxa"/>
             <w:hideMark/>
           </w:tcPr>
           <w:p>
@@ -13790,7 +14106,7 @@
         </w:tc>
         <w:tc>
           <w:tcPr>
-            <w:tcW w:w="0" w:type="auto"/>
+            <w:tcW w:w="3791" w:type="dxa"/>
             <w:hideMark/>
           </w:tcPr>
           <w:p>
@@ -13803,7 +14119,13 @@
               <w:rPr>
                 <w:lang w:val="en-US"/>
               </w:rPr>
-              <w:t>Parametar k petog križara</w:t>
+              <w:t xml:space="preserve">Parametar k </w:t>
+            </w:r>
+            <w:r>
+              <w:rPr>
+                <w:lang w:val="en-US"/>
+              </w:rPr>
+              <w:t>operatora križanja s K izmjena stupaca</w:t>
             </w:r>
           </w:p>
         </w:tc>
@@ -13842,7 +14164,7 @@
                       <w:rPr>
                         <w:rFonts w:ascii="Cambria Math" w:hAnsi="Cambria Math"/>
                       </w:rPr>
-                      <m:t>0, 10</m:t>
+                      <m:t>2, 8</m:t>
                     </m:r>
                   </m:e>
                 </m:d>
@@ -13856,7 +14178,7 @@
                   <w:rPr>
                     <w:rFonts w:ascii="Cambria Math" w:hAnsi="Cambria Math"/>
                   </w:rPr>
-                  <m:t>R</m:t>
+                  <m:t>N</m:t>
                 </m:r>
               </m:oMath>
             </m:oMathPara>
@@ -13866,7 +14188,7 @@
       <w:tr>
         <w:tc>
           <w:tcPr>
-            <w:tcW w:w="0" w:type="auto"/>
+            <w:tcW w:w="2065" w:type="dxa"/>
             <w:hideMark/>
           </w:tcPr>
           <w:p>
@@ -13885,7 +14207,7 @@
         </w:tc>
         <w:tc>
           <w:tcPr>
-            <w:tcW w:w="0" w:type="auto"/>
+            <w:tcW w:w="3791" w:type="dxa"/>
             <w:hideMark/>
           </w:tcPr>
           <w:p>
@@ -13898,7 +14220,7 @@
               <w:rPr>
                 <w:lang w:val="en-US"/>
               </w:rPr>
-              <w:t>Parametar p petog križara</w:t>
+              <w:t>Vjerojatnost petog križanja</w:t>
             </w:r>
           </w:p>
         </w:tc>
@@ -13937,7 +14259,7 @@
                       <w:rPr>
                         <w:rFonts w:ascii="Cambria Math" w:hAnsi="Cambria Math"/>
                       </w:rPr>
-                      <m:t>0, 10</m:t>
+                      <m:t>0.1, 0.95</m:t>
                     </m:r>
                   </m:e>
                 </m:d>
@@ -13961,7 +14283,7 @@
       <w:tr>
         <w:tc>
           <w:tcPr>
-            <w:tcW w:w="0" w:type="auto"/>
+            <w:tcW w:w="2065" w:type="dxa"/>
             <w:hideMark/>
           </w:tcPr>
           <w:p>
@@ -13974,13 +14296,25 @@
               <w:rPr>
                 <w:lang w:val="en-US"/>
               </w:rPr>
-              <w:t>crossover_child5_weight</w:t>
+              <w:t>crossover_child5_</w:t>
+            </w:r>
+            <w:r>
+              <w:rPr>
+                <w:lang w:val="en-US"/>
+              </w:rPr>
+              <w:t xml:space="preserve"> </w:t>
+            </w:r>
+            <w:r>
+              <w:rPr>
+                <w:lang w:val="en-US"/>
+              </w:rPr>
+              <w:t>weight</w:t>
             </w:r>
           </w:p>
         </w:tc>
         <w:tc>
           <w:tcPr>
-            <w:tcW w:w="0" w:type="auto"/>
+            <w:tcW w:w="3791" w:type="dxa"/>
             <w:hideMark/>
           </w:tcPr>
           <w:p>
@@ -13993,7 +14327,13 @@
               <w:rPr>
                 <w:lang w:val="en-US"/>
               </w:rPr>
-              <w:t>Vjerojatnost odabira petog križara</w:t>
+              <w:t xml:space="preserve">Vjerojatnost odabira petog </w:t>
+            </w:r>
+            <w:r>
+              <w:rPr>
+                <w:lang w:val="en-US"/>
+              </w:rPr>
+              <w:t>križanja</w:t>
             </w:r>
           </w:p>
         </w:tc>
@@ -14032,7 +14372,7 @@
                       <w:rPr>
                         <w:rFonts w:ascii="Cambria Math" w:hAnsi="Cambria Math"/>
                       </w:rPr>
-                      <m:t>0, 10</m:t>
+                      <m:t>0.1, 1</m:t>
                     </m:r>
                   </m:e>
                 </m:d>
@@ -14053,86 +14393,6 @@
           </w:p>
         </w:tc>
       </w:tr>
-      <w:tr>
-        <w:tc>
-          <w:tcPr>
-            <w:tcW w:w="3910" w:type="dxa"/>
-          </w:tcPr>
-          <w:p/>
-        </w:tc>
-        <w:tc>
-          <w:tcPr>
-            <w:tcW w:w="1946" w:type="dxa"/>
-          </w:tcPr>
-          <w:p/>
-        </w:tc>
-        <w:tc>
-          <w:tcPr>
-            <w:tcW w:w="2922" w:type="dxa"/>
-          </w:tcPr>
-          <w:p/>
-        </w:tc>
-      </w:tr>
-      <w:tr>
-        <w:tc>
-          <w:tcPr>
-            <w:tcW w:w="3910" w:type="dxa"/>
-          </w:tcPr>
-          <w:p/>
-        </w:tc>
-        <w:tc>
-          <w:tcPr>
-            <w:tcW w:w="1946" w:type="dxa"/>
-          </w:tcPr>
-          <w:p/>
-        </w:tc>
-        <w:tc>
-          <w:tcPr>
-            <w:tcW w:w="2922" w:type="dxa"/>
-          </w:tcPr>
-          <w:p/>
-        </w:tc>
-      </w:tr>
-      <w:tr>
-        <w:tc>
-          <w:tcPr>
-            <w:tcW w:w="3910" w:type="dxa"/>
-          </w:tcPr>
-          <w:p/>
-        </w:tc>
-        <w:tc>
-          <w:tcPr>
-            <w:tcW w:w="1946" w:type="dxa"/>
-          </w:tcPr>
-          <w:p/>
-        </w:tc>
-        <w:tc>
-          <w:tcPr>
-            <w:tcW w:w="2922" w:type="dxa"/>
-          </w:tcPr>
-          <w:p/>
-        </w:tc>
-      </w:tr>
-      <w:tr>
-        <w:tc>
-          <w:tcPr>
-            <w:tcW w:w="3910" w:type="dxa"/>
-          </w:tcPr>
-          <w:p/>
-        </w:tc>
-        <w:tc>
-          <w:tcPr>
-            <w:tcW w:w="1946" w:type="dxa"/>
-          </w:tcPr>
-          <w:p/>
-        </w:tc>
-        <w:tc>
-          <w:tcPr>
-            <w:tcW w:w="2922" w:type="dxa"/>
-          </w:tcPr>
-          <w:p/>
-        </w:tc>
-      </w:tr>
     </w:tbl>
     <w:p/>
     <w:p>
@@ -14149,6 +14409,11 @@
         <w:t>Rezultati</w:t>
       </w:r>
       <w:bookmarkEnd w:id="74"/>
+    </w:p>
+    <w:p>
+      <w:r>
+        <w:t>U ovome poglavlju tumačiti ćemo rezultate optimizacije hiperparametara</w:t>
+      </w:r>
     </w:p>
     <w:p>
       <w:pPr>

</xml_diff>